<commit_message>
add some changes in tenancy contract
</commit_message>
<xml_diff>
--- a/TenancyContract.docx
+++ b/TenancyContract.docx
@@ -2667,6 +2667,922 @@
         </w:rPr>
       </w:pPr>
     </w:p>
+    <w:tbl>
+      <w:tblPr>
+        <w:tblStyle w:val="TableGrid"/>
+        <w:tblpPr w:leftFromText="180" w:rightFromText="180" w:vertAnchor="text" w:horzAnchor="margin" w:tblpXSpec="center" w:tblpY="504"/>
+        <w:tblW w:w="0" w:type="auto"/>
+        <w:tblCellMar>
+          <w:top w:w="85" w:type="dxa"/>
+          <w:bottom w:w="85" w:type="dxa"/>
+        </w:tblCellMar>
+        <w:tblLook w:val="04A0" w:firstRow="1" w:lastRow="0" w:firstColumn="1" w:lastColumn="0" w:noHBand="0" w:noVBand="1"/>
+      </w:tblPr>
+      <w:tblGrid>
+        <w:gridCol w:w="4106"/>
+        <w:gridCol w:w="1134"/>
+        <w:gridCol w:w="111"/>
+        <w:gridCol w:w="3575"/>
+        <w:gridCol w:w="425"/>
+        <w:gridCol w:w="425"/>
+        <w:gridCol w:w="926"/>
+      </w:tblGrid>
+      <w:tr>
+        <w:trPr>
+          <w:trHeight w:val="189"/>
+        </w:trPr>
+        <w:tc>
+          <w:tcPr>
+            <w:tcW w:w="5240" w:type="dxa"/>
+            <w:gridSpan w:val="2"/>
+            <w:tcBorders>
+              <w:right w:val="nil"/>
+            </w:tcBorders>
+            <w:shd w:val="clear" w:color="auto" w:fill="002060"/>
+          </w:tcPr>
+          <w:p>
+            <w:r>
+              <w:t>General information</w:t>
+            </w:r>
+          </w:p>
+        </w:tc>
+        <w:tc>
+          <w:tcPr>
+            <w:tcW w:w="5462" w:type="dxa"/>
+            <w:gridSpan w:val="5"/>
+            <w:tcBorders>
+              <w:left w:val="nil"/>
+            </w:tcBorders>
+            <w:shd w:val="clear" w:color="auto" w:fill="002060"/>
+          </w:tcPr>
+          <w:p>
+            <w:pPr>
+              <w:jc w:val="right"/>
+              <w:rPr>
+                <w:rFonts w:ascii="Microsoft Sans Serif" w:hAnsi="Microsoft Sans Serif" w:cs="Microsoft Sans Serif"/>
+              </w:rPr>
+            </w:pPr>
+            <w:proofErr w:type="spellStart"/>
+            <w:r>
+              <w:rPr>
+                <w:rFonts w:ascii="Microsoft Sans Serif" w:hAnsi="Microsoft Sans Serif" w:cs="Microsoft Sans Serif"/>
+              </w:rPr>
+              <w:t>معلومات</w:t>
+            </w:r>
+            <w:proofErr w:type="spellEnd"/>
+            <w:r>
+              <w:rPr>
+                <w:rFonts w:ascii="Microsoft Sans Serif" w:hAnsi="Microsoft Sans Serif" w:cs="Microsoft Sans Serif"/>
+              </w:rPr>
+              <w:t xml:space="preserve"> </w:t>
+            </w:r>
+            <w:proofErr w:type="spellStart"/>
+            <w:r>
+              <w:rPr>
+                <w:rFonts w:ascii="Microsoft Sans Serif" w:hAnsi="Microsoft Sans Serif" w:cs="Microsoft Sans Serif"/>
+              </w:rPr>
+              <w:t>عامة</w:t>
+            </w:r>
+            <w:proofErr w:type="spellEnd"/>
+          </w:p>
+        </w:tc>
+      </w:tr>
+      <w:tr>
+        <w:trPr>
+          <w:trHeight w:val="189"/>
+        </w:trPr>
+        <w:tc>
+          <w:tcPr>
+            <w:tcW w:w="4106" w:type="dxa"/>
+            <w:tcBorders>
+              <w:top w:val="nil"/>
+              <w:left w:val="single" w:sz="12" w:space="0" w:color="D0CECE" w:themeColor="background2" w:themeShade="E6"/>
+              <w:bottom w:val="nil"/>
+              <w:right w:val="nil"/>
+            </w:tcBorders>
+            <w:shd w:val="clear" w:color="auto" w:fill="auto"/>
+          </w:tcPr>
+          <w:p>
+            <w:pPr>
+              <w:rPr>
+                <w:rFonts w:ascii="Microsoft Sans Serif" w:hAnsi="Microsoft Sans Serif" w:cs="Microsoft Sans Serif"/>
+              </w:rPr>
+            </w:pPr>
+            <w:r>
+              <w:rPr>
+                <w:rFonts w:ascii="Microsoft Sans Serif" w:hAnsi="Microsoft Sans Serif" w:cs="Microsoft Sans Serif"/>
+                <w:noProof/>
+                <w:color w:val="002060"/>
+              </w:rPr>
+              <mc:AlternateContent>
+                <mc:Choice Requires="wps">
+                  <w:drawing>
+                    <wp:anchor distT="0" distB="0" distL="114300" distR="114300" simplePos="0" relativeHeight="251749376" behindDoc="0" locked="0" layoutInCell="1" allowOverlap="1" wp14:anchorId="50550A72" wp14:editId="566F06A3">
+                      <wp:simplePos x="0" y="0"/>
+                      <wp:positionH relativeFrom="column">
+                        <wp:posOffset>690880</wp:posOffset>
+                      </wp:positionH>
+                      <wp:positionV relativeFrom="paragraph">
+                        <wp:posOffset>155575</wp:posOffset>
+                      </wp:positionV>
+                      <wp:extent cx="1967230" cy="0"/>
+                      <wp:effectExtent l="0" t="0" r="0" b="0"/>
+                      <wp:wrapNone/>
+                      <wp:docPr id="1356212704" name="Straight Connector 112"/>
+                      <wp:cNvGraphicFramePr/>
+                      <a:graphic xmlns:a="http://schemas.openxmlformats.org/drawingml/2006/main">
+                        <a:graphicData uri="http://schemas.microsoft.com/office/word/2010/wordprocessingShape">
+                          <wps:wsp>
+                            <wps:cNvCnPr/>
+                            <wps:spPr>
+                              <a:xfrm flipV="1">
+                                <a:off x="0" y="0"/>
+                                <a:ext cx="1967230" cy="0"/>
+                              </a:xfrm>
+                              <a:prstGeom prst="line">
+                                <a:avLst/>
+                              </a:prstGeom>
+                              <a:ln w="9525" cap="flat" cmpd="sng" algn="ctr">
+                                <a:solidFill>
+                                  <a:schemeClr val="bg2">
+                                    <a:lumMod val="90000"/>
+                                  </a:schemeClr>
+                                </a:solidFill>
+                                <a:prstDash val="dash"/>
+                                <a:round/>
+                                <a:headEnd type="none" w="med" len="med"/>
+                                <a:tailEnd type="none" w="med" len="med"/>
+                              </a:ln>
+                            </wps:spPr>
+                            <wps:style>
+                              <a:lnRef idx="0">
+                                <a:scrgbClr r="0" g="0" b="0"/>
+                              </a:lnRef>
+                              <a:fillRef idx="0">
+                                <a:scrgbClr r="0" g="0" b="0"/>
+                              </a:fillRef>
+                              <a:effectRef idx="0">
+                                <a:scrgbClr r="0" g="0" b="0"/>
+                              </a:effectRef>
+                              <a:fontRef idx="minor">
+                                <a:schemeClr val="tx1"/>
+                              </a:fontRef>
+                            </wps:style>
+                            <wps:bodyPr/>
+                          </wps:wsp>
+                        </a:graphicData>
+                      </a:graphic>
+                      <wp14:sizeRelH relativeFrom="margin">
+                        <wp14:pctWidth>0</wp14:pctWidth>
+                      </wp14:sizeRelH>
+                      <wp14:sizeRelV relativeFrom="margin">
+                        <wp14:pctHeight>0</wp14:pctHeight>
+                      </wp14:sizeRelV>
+                    </wp:anchor>
+                  </w:drawing>
+                </mc:Choice>
+                <mc:Fallback xmlns:pic="http://schemas.openxmlformats.org/drawingml/2006/picture" xmlns:a14="http://schemas.microsoft.com/office/drawing/2010/main" xmlns:a="http://schemas.openxmlformats.org/drawingml/2006/main">
+                  <w:pict>
+                    <v:line id="Straight Connector 112" style="position:absolute;flip:y;z-index:251749376;visibility:visible;mso-wrap-style:square;mso-width-percent:0;mso-height-percent:0;mso-wrap-distance-left:9pt;mso-wrap-distance-top:0;mso-wrap-distance-right:9pt;mso-wrap-distance-bottom:0;mso-position-horizontal:absolute;mso-position-horizontal-relative:text;mso-position-vertical:absolute;mso-position-vertical-relative:text;mso-width-percent:0;mso-height-percent:0;mso-width-relative:margin;mso-height-relative:margin" o:spid="_x0000_s1026" strokecolor="#cfcdcd [2894]" o:gfxdata="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" from="54.4pt,12.25pt" to="209.3pt,12.25pt" w14:anchorId="40172BCE">
+                      <v:stroke dashstyle="dash"/>
+                    </v:line>
+                  </w:pict>
+                </mc:Fallback>
+              </mc:AlternateContent>
+            </w:r>
+            <w:r>
+              <w:rPr>
+                <w:rFonts w:ascii="Microsoft Sans Serif" w:hAnsi="Microsoft Sans Serif" w:cs="Microsoft Sans Serif"/>
+                <w:noProof/>
+                <w:color w:val="002060"/>
+                <w:lang w:val="en-US"/>
+              </w:rPr>
+              <w:t>Contract ID</w:t>
+            </w:r>
+            <w:r>
+              <w:rPr>
+                <w:rFonts w:ascii="Microsoft Sans Serif" w:hAnsi="Microsoft Sans Serif" w:cs="Microsoft Sans Serif"/>
+                <w:color w:val="002060"/>
+              </w:rPr>
+              <w:t>.</w:t>
+            </w:r>
+            <w:r>
+              <w:rPr>
+                <w:rFonts w:ascii="Microsoft Sans Serif" w:hAnsi="Microsoft Sans Serif" w:cs="Microsoft Sans Serif"/>
+                <w:color w:val="002060"/>
+              </w:rPr>
+              <w:t xml:space="preserve">  </w:t>
+            </w:r>
+            <w:sdt>
+              <w:sdtPr>
+                <w:rPr>
+                  <w:rFonts w:ascii="Microsoft Sans Serif" w:hAnsi="Microsoft Sans Serif" w:cs="Microsoft Sans Serif"/>
+                </w:rPr>
+                <w:alias w:val="#Nav: /TenancyContract/Contract_ID"/>
+                <w:tag w:val="#Nav: Tenancy_Contract/50101"/>
+                <w:id w:val="1288322857"/>
+                <w:placeholder>
+                  <w:docPart w:val="DefaultPlaceholder_-1854013440"/>
+                </w:placeholder>
+                <w:dataBinding w:prefixMappings="xmlns:ns0='urn:microsoft-dynamics-nav/reports/Tenancy_Contract/50101/'" w:xpath="/ns0:NavWordReportXmlPart[1]/ns0:TenancyContract[1]/ns0:Contract_ID[1]" w:storeItemID="{B8787D49-5AAC-4AAC-A9D8-A7D9793FE4D0}"/>
+                <w:text/>
+              </w:sdtPr>
+              <w:sdtContent>
+                <w:proofErr w:type="spellStart"/>
+                <w:r>
+                  <w:rPr>
+                    <w:rFonts w:ascii="Microsoft Sans Serif" w:hAnsi="Microsoft Sans Serif" w:cs="Microsoft Sans Serif"/>
+                  </w:rPr>
+                  <w:t>Contract_ID</w:t>
+                </w:r>
+                <w:proofErr w:type="spellEnd"/>
+              </w:sdtContent>
+            </w:sdt>
+          </w:p>
+        </w:tc>
+        <w:tc>
+          <w:tcPr>
+            <w:tcW w:w="1245" w:type="dxa"/>
+            <w:gridSpan w:val="2"/>
+            <w:tcBorders>
+              <w:top w:val="nil"/>
+              <w:left w:val="nil"/>
+              <w:bottom w:val="nil"/>
+              <w:right w:val="nil"/>
+            </w:tcBorders>
+            <w:shd w:val="clear" w:color="auto" w:fill="FFFFFF" w:themeFill="background1"/>
+          </w:tcPr>
+          <w:p>
+            <w:pPr>
+              <w:jc w:val="right"/>
+              <w:rPr>
+                <w:rFonts w:ascii="Microsoft Sans Serif" w:hAnsi="Microsoft Sans Serif" w:cs="Microsoft Sans Serif"/>
+                <w:color w:val="002060"/>
+              </w:rPr>
+            </w:pPr>
+            <w:proofErr w:type="spellStart"/>
+            <w:r>
+              <w:rPr>
+                <w:rFonts w:ascii="Microsoft Sans Serif" w:hAnsi="Microsoft Sans Serif" w:cs="Microsoft Sans Serif"/>
+                <w:color w:val="002060"/>
+              </w:rPr>
+              <w:t>معرف</w:t>
+            </w:r>
+            <w:proofErr w:type="spellEnd"/>
+            <w:r>
+              <w:rPr>
+                <w:rFonts w:ascii="Microsoft Sans Serif" w:hAnsi="Microsoft Sans Serif" w:cs="Microsoft Sans Serif"/>
+                <w:color w:val="002060"/>
+              </w:rPr>
+              <w:t xml:space="preserve"> </w:t>
+            </w:r>
+            <w:proofErr w:type="spellStart"/>
+            <w:r>
+              <w:rPr>
+                <w:rFonts w:ascii="Microsoft Sans Serif" w:hAnsi="Microsoft Sans Serif" w:cs="Microsoft Sans Serif"/>
+                <w:color w:val="002060"/>
+              </w:rPr>
+              <w:t>العقد</w:t>
+            </w:r>
+            <w:proofErr w:type="spellEnd"/>
+          </w:p>
+        </w:tc>
+        <w:tc>
+          <w:tcPr>
+            <w:tcW w:w="4425" w:type="dxa"/>
+            <w:gridSpan w:val="3"/>
+            <w:tcBorders>
+              <w:top w:val="nil"/>
+              <w:left w:val="nil"/>
+              <w:bottom w:val="nil"/>
+              <w:right w:val="nil"/>
+            </w:tcBorders>
+            <w:shd w:val="clear" w:color="auto" w:fill="FFFFFF" w:themeFill="background1"/>
+          </w:tcPr>
+          <w:p>
+            <w:pPr>
+              <w:rPr>
+                <w:rFonts w:ascii="Microsoft Sans Serif" w:hAnsi="Microsoft Sans Serif" w:cs="Microsoft Sans Serif"/>
+              </w:rPr>
+            </w:pPr>
+            <w:r>
+              <w:rPr>
+                <w:rFonts w:ascii="Microsoft Sans Serif" w:hAnsi="Microsoft Sans Serif" w:cs="Microsoft Sans Serif"/>
+                <w:noProof/>
+                <w:color w:val="002060"/>
+              </w:rPr>
+              <mc:AlternateContent>
+                <mc:Choice Requires="wps">
+                  <w:drawing>
+                    <wp:anchor distT="0" distB="0" distL="114300" distR="114300" simplePos="0" relativeHeight="251750400" behindDoc="0" locked="0" layoutInCell="1" allowOverlap="1" wp14:anchorId="37C53A37" wp14:editId="31D1908D">
+                      <wp:simplePos x="0" y="0"/>
+                      <wp:positionH relativeFrom="column">
+                        <wp:posOffset>853440</wp:posOffset>
+                      </wp:positionH>
+                      <wp:positionV relativeFrom="paragraph">
+                        <wp:posOffset>135890</wp:posOffset>
+                      </wp:positionV>
+                      <wp:extent cx="1987550" cy="6350"/>
+                      <wp:effectExtent l="0" t="0" r="12700" b="31750"/>
+                      <wp:wrapNone/>
+                      <wp:docPr id="1265637804" name="Straight Connector 112"/>
+                      <wp:cNvGraphicFramePr/>
+                      <a:graphic xmlns:a="http://schemas.openxmlformats.org/drawingml/2006/main">
+                        <a:graphicData uri="http://schemas.microsoft.com/office/word/2010/wordprocessingShape">
+                          <wps:wsp>
+                            <wps:cNvCnPr/>
+                            <wps:spPr>
+                              <a:xfrm flipV="1">
+                                <a:off x="0" y="0"/>
+                                <a:ext cx="1987550" cy="6350"/>
+                              </a:xfrm>
+                              <a:prstGeom prst="line">
+                                <a:avLst/>
+                              </a:prstGeom>
+                              <a:ln w="9525" cap="flat" cmpd="sng" algn="ctr">
+                                <a:solidFill>
+                                  <a:schemeClr val="bg2">
+                                    <a:lumMod val="90000"/>
+                                  </a:schemeClr>
+                                </a:solidFill>
+                                <a:prstDash val="dash"/>
+                                <a:round/>
+                                <a:headEnd type="none" w="med" len="med"/>
+                                <a:tailEnd type="none" w="med" len="med"/>
+                              </a:ln>
+                            </wps:spPr>
+                            <wps:style>
+                              <a:lnRef idx="0">
+                                <a:scrgbClr r="0" g="0" b="0"/>
+                              </a:lnRef>
+                              <a:fillRef idx="0">
+                                <a:scrgbClr r="0" g="0" b="0"/>
+                              </a:fillRef>
+                              <a:effectRef idx="0">
+                                <a:scrgbClr r="0" g="0" b="0"/>
+                              </a:effectRef>
+                              <a:fontRef idx="minor">
+                                <a:schemeClr val="tx1"/>
+                              </a:fontRef>
+                            </wps:style>
+                            <wps:bodyPr/>
+                          </wps:wsp>
+                        </a:graphicData>
+                      </a:graphic>
+                      <wp14:sizeRelH relativeFrom="margin">
+                        <wp14:pctWidth>0</wp14:pctWidth>
+                      </wp14:sizeRelH>
+                      <wp14:sizeRelV relativeFrom="margin">
+                        <wp14:pctHeight>0</wp14:pctHeight>
+                      </wp14:sizeRelV>
+                    </wp:anchor>
+                  </w:drawing>
+                </mc:Choice>
+                <mc:Fallback xmlns:pic="http://schemas.openxmlformats.org/drawingml/2006/picture" xmlns:a14="http://schemas.microsoft.com/office/drawing/2010/main" xmlns:a="http://schemas.openxmlformats.org/drawingml/2006/main">
+                  <w:pict>
+                    <v:line id="Straight Connector 112" style="position:absolute;flip:y;z-index:251750400;visibility:visible;mso-wrap-style:square;mso-width-percent:0;mso-height-percent:0;mso-wrap-distance-left:9pt;mso-wrap-distance-top:0;mso-wrap-distance-right:9pt;mso-wrap-distance-bottom:0;mso-position-horizontal:absolute;mso-position-horizontal-relative:text;mso-position-vertical:absolute;mso-position-vertical-relative:text;mso-width-percent:0;mso-height-percent:0;mso-width-relative:margin;mso-height-relative:margin" o:spid="_x0000_s1026" strokecolor="#cfcdcd [2894]" o:gfxdata="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" from="67.2pt,10.7pt" to="223.7pt,11.2pt" w14:anchorId="556E56D0">
+                      <v:stroke dashstyle="dash"/>
+                    </v:line>
+                  </w:pict>
+                </mc:Fallback>
+              </mc:AlternateContent>
+            </w:r>
+            <w:r>
+              <w:rPr>
+                <w:rFonts w:ascii="Microsoft Sans Serif" w:hAnsi="Microsoft Sans Serif" w:cs="Microsoft Sans Serif"/>
+                <w:noProof/>
+                <w:color w:val="002060"/>
+                <w:lang w:val="en-US"/>
+              </w:rPr>
+              <w:t xml:space="preserve"> Contract Type</w:t>
+            </w:r>
+            <w:r>
+              <w:rPr>
+                <w:rFonts w:ascii="Microsoft Sans Serif" w:hAnsi="Microsoft Sans Serif" w:cs="Microsoft Sans Serif"/>
+                <w:noProof/>
+                <w:color w:val="002060"/>
+                <w:lang w:val="en-US"/>
+              </w:rPr>
+              <w:t xml:space="preserve"> </w:t>
+            </w:r>
+            <w:sdt>
+              <w:sdtPr>
+                <w:rPr>
+                  <w:rFonts w:ascii="Microsoft Sans Serif" w:hAnsi="Microsoft Sans Serif" w:cs="Microsoft Sans Serif"/>
+                  <w:noProof/>
+                </w:rPr>
+                <w:alias w:val="#Nav: /TenancyContract/Contract_Type"/>
+                <w:tag w:val="#Nav: Tenancy_Contract/50101"/>
+                <w:id w:val="-276947631"/>
+                <w:placeholder>
+                  <w:docPart w:val="DefaultPlaceholder_-1854013440"/>
+                </w:placeholder>
+                <w:dataBinding w:prefixMappings="xmlns:ns0='urn:microsoft-dynamics-nav/reports/Tenancy_Contract/50101/'" w:xpath="/ns0:NavWordReportXmlPart[1]/ns0:TenancyContract[1]/ns0:Contract_Type[1]" w:storeItemID="{B8787D49-5AAC-4AAC-A9D8-A7D9793FE4D0}"/>
+                <w:text/>
+              </w:sdtPr>
+              <w:sdtContent>
+                <w:r>
+                  <w:rPr>
+                    <w:rFonts w:ascii="Microsoft Sans Serif" w:hAnsi="Microsoft Sans Serif" w:cs="Microsoft Sans Serif"/>
+                    <w:noProof/>
+                    <w:lang w:val="en-US"/>
+                  </w:rPr>
+                  <w:t>Contract_Type</w:t>
+                </w:r>
+              </w:sdtContent>
+            </w:sdt>
+          </w:p>
+        </w:tc>
+        <w:tc>
+          <w:tcPr>
+            <w:tcW w:w="926" w:type="dxa"/>
+            <w:tcBorders>
+              <w:top w:val="nil"/>
+              <w:left w:val="nil"/>
+              <w:bottom w:val="nil"/>
+              <w:right w:val="single" w:sz="12" w:space="0" w:color="D0CECE" w:themeColor="background2" w:themeShade="E6"/>
+            </w:tcBorders>
+            <w:shd w:val="clear" w:color="auto" w:fill="auto"/>
+          </w:tcPr>
+          <w:p>
+            <w:pPr>
+              <w:jc w:val="right"/>
+              <w:rPr>
+                <w:rFonts w:ascii="Microsoft Sans Serif" w:hAnsi="Microsoft Sans Serif" w:cs="Microsoft Sans Serif"/>
+              </w:rPr>
+            </w:pPr>
+            <w:proofErr w:type="spellStart"/>
+            <w:r>
+              <w:rPr>
+                <w:rFonts w:ascii="Microsoft Sans Serif" w:hAnsi="Microsoft Sans Serif" w:cs="Microsoft Sans Serif"/>
+                <w:color w:val="002060"/>
+              </w:rPr>
+              <w:t>نوع</w:t>
+            </w:r>
+            <w:proofErr w:type="spellEnd"/>
+            <w:r>
+              <w:rPr>
+                <w:rFonts w:ascii="Microsoft Sans Serif" w:hAnsi="Microsoft Sans Serif" w:cs="Microsoft Sans Serif"/>
+                <w:color w:val="002060"/>
+              </w:rPr>
+              <w:t xml:space="preserve"> </w:t>
+            </w:r>
+            <w:proofErr w:type="spellStart"/>
+            <w:r>
+              <w:rPr>
+                <w:rFonts w:ascii="Microsoft Sans Serif" w:hAnsi="Microsoft Sans Serif" w:cs="Microsoft Sans Serif"/>
+                <w:color w:val="002060"/>
+              </w:rPr>
+              <w:t>العقد</w:t>
+            </w:r>
+            <w:proofErr w:type="spellEnd"/>
+          </w:p>
+        </w:tc>
+      </w:tr>
+      <w:tr>
+        <w:trPr>
+          <w:trHeight w:val="189"/>
+        </w:trPr>
+        <w:tc>
+          <w:tcPr>
+            <w:tcW w:w="9351" w:type="dxa"/>
+            <w:gridSpan w:val="5"/>
+            <w:tcBorders>
+              <w:top w:val="nil"/>
+              <w:left w:val="single" w:sz="12" w:space="0" w:color="D0CECE" w:themeColor="background2" w:themeShade="E6"/>
+              <w:bottom w:val="nil"/>
+              <w:right w:val="nil"/>
+            </w:tcBorders>
+            <w:shd w:val="clear" w:color="auto" w:fill="FFFFFF" w:themeFill="background1"/>
+          </w:tcPr>
+          <w:p>
+            <w:pPr>
+              <w:tabs>
+                <w:tab w:val="left" w:pos="5460"/>
+              </w:tabs>
+              <w:rPr>
+                <w:rFonts w:ascii="Microsoft Sans Serif" w:hAnsi="Microsoft Sans Serif" w:cs="Microsoft Sans Serif"/>
+              </w:rPr>
+            </w:pPr>
+            <w:r>
+              <w:rPr>
+                <w:rFonts w:ascii="Microsoft Sans Serif" w:hAnsi="Microsoft Sans Serif" w:cs="Microsoft Sans Serif"/>
+                <w:noProof/>
+                <w:color w:val="002060"/>
+              </w:rPr>
+              <mc:AlternateContent>
+                <mc:Choice Requires="wps">
+                  <w:drawing>
+                    <wp:anchor distT="0" distB="0" distL="114300" distR="114300" simplePos="0" relativeHeight="251752448" behindDoc="0" locked="0" layoutInCell="1" allowOverlap="1" wp14:anchorId="46302DE8" wp14:editId="45DE2402">
+                      <wp:simplePos x="0" y="0"/>
+                      <wp:positionH relativeFrom="column">
+                        <wp:posOffset>728980</wp:posOffset>
+                      </wp:positionH>
+                      <wp:positionV relativeFrom="paragraph">
+                        <wp:posOffset>163830</wp:posOffset>
+                      </wp:positionV>
+                      <wp:extent cx="5273040" cy="0"/>
+                      <wp:effectExtent l="0" t="0" r="0" b="0"/>
+                      <wp:wrapNone/>
+                      <wp:docPr id="1326958949" name="Straight Connector 112"/>
+                      <wp:cNvGraphicFramePr/>
+                      <a:graphic xmlns:a="http://schemas.openxmlformats.org/drawingml/2006/main">
+                        <a:graphicData uri="http://schemas.microsoft.com/office/word/2010/wordprocessingShape">
+                          <wps:wsp>
+                            <wps:cNvCnPr/>
+                            <wps:spPr>
+                              <a:xfrm flipV="1">
+                                <a:off x="0" y="0"/>
+                                <a:ext cx="5273040" cy="0"/>
+                              </a:xfrm>
+                              <a:prstGeom prst="line">
+                                <a:avLst/>
+                              </a:prstGeom>
+                              <a:ln w="9525" cap="flat" cmpd="sng" algn="ctr">
+                                <a:solidFill>
+                                  <a:schemeClr val="bg2">
+                                    <a:lumMod val="90000"/>
+                                  </a:schemeClr>
+                                </a:solidFill>
+                                <a:prstDash val="dash"/>
+                                <a:round/>
+                                <a:headEnd type="none" w="med" len="med"/>
+                                <a:tailEnd type="none" w="med" len="med"/>
+                              </a:ln>
+                            </wps:spPr>
+                            <wps:style>
+                              <a:lnRef idx="0">
+                                <a:scrgbClr r="0" g="0" b="0"/>
+                              </a:lnRef>
+                              <a:fillRef idx="0">
+                                <a:scrgbClr r="0" g="0" b="0"/>
+                              </a:fillRef>
+                              <a:effectRef idx="0">
+                                <a:scrgbClr r="0" g="0" b="0"/>
+                              </a:effectRef>
+                              <a:fontRef idx="minor">
+                                <a:schemeClr val="tx1"/>
+                              </a:fontRef>
+                            </wps:style>
+                            <wps:bodyPr/>
+                          </wps:wsp>
+                        </a:graphicData>
+                      </a:graphic>
+                      <wp14:sizeRelH relativeFrom="margin">
+                        <wp14:pctWidth>0</wp14:pctWidth>
+                      </wp14:sizeRelH>
+                      <wp14:sizeRelV relativeFrom="margin">
+                        <wp14:pctHeight>0</wp14:pctHeight>
+                      </wp14:sizeRelV>
+                    </wp:anchor>
+                  </w:drawing>
+                </mc:Choice>
+                <mc:Fallback xmlns:pic="http://schemas.openxmlformats.org/drawingml/2006/picture" xmlns:a14="http://schemas.microsoft.com/office/drawing/2010/main" xmlns:a="http://schemas.openxmlformats.org/drawingml/2006/main">
+                  <w:pict>
+                    <v:line id="Straight Connector 112" style="position:absolute;flip:y;z-index:251752448;visibility:visible;mso-wrap-style:square;mso-width-percent:0;mso-height-percent:0;mso-wrap-distance-left:9pt;mso-wrap-distance-top:0;mso-wrap-distance-right:9pt;mso-wrap-distance-bottom:0;mso-position-horizontal:absolute;mso-position-horizontal-relative:text;mso-position-vertical:absolute;mso-position-vertical-relative:text;mso-width-percent:0;mso-height-percent:0;mso-width-relative:margin;mso-height-relative:margin" o:spid="_x0000_s1026" strokecolor="#cfcdcd [2894]" o:gfxdata="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" from="57.4pt,12.9pt" to="472.6pt,12.9pt" w14:anchorId="31069234">
+                      <v:stroke dashstyle="dash"/>
+                    </v:line>
+                  </w:pict>
+                </mc:Fallback>
+              </mc:AlternateContent>
+            </w:r>
+            <w:r>
+              <w:rPr>
+                <w:rFonts w:ascii="Microsoft Sans Serif" w:hAnsi="Microsoft Sans Serif" w:cs="Microsoft Sans Serif"/>
+                <w:color w:val="002060"/>
+              </w:rPr>
+              <w:t xml:space="preserve">Proposal ID </w:t>
+            </w:r>
+            <w:r>
+              <w:rPr>
+                <w:rFonts w:ascii="Microsoft Sans Serif" w:hAnsi="Microsoft Sans Serif" w:cs="Microsoft Sans Serif"/>
+              </w:rPr>
+              <w:t xml:space="preserve"> </w:t>
+            </w:r>
+            <w:sdt>
+              <w:sdtPr>
+                <w:rPr>
+                  <w:rFonts w:ascii="Microsoft Sans Serif" w:hAnsi="Microsoft Sans Serif" w:cs="Microsoft Sans Serif"/>
+                </w:rPr>
+                <w:alias w:val="#Nav: /TenancyContract/Proposal_ID"/>
+                <w:tag w:val="#Nav: Tenancy_Contract/50101"/>
+                <w:id w:val="-1419239725"/>
+                <w:placeholder>
+                  <w:docPart w:val="DefaultPlaceholder_-1854013440"/>
+                </w:placeholder>
+                <w:dataBinding w:prefixMappings="xmlns:ns0='urn:microsoft-dynamics-nav/reports/Tenancy_Contract/50101/'" w:xpath="/ns0:NavWordReportXmlPart[1]/ns0:TenancyContract[1]/ns0:Proposal_ID[1]" w:storeItemID="{B8787D49-5AAC-4AAC-A9D8-A7D9793FE4D0}"/>
+                <w:text/>
+              </w:sdtPr>
+              <w:sdtContent>
+                <w:proofErr w:type="spellStart"/>
+                <w:r>
+                  <w:rPr>
+                    <w:rFonts w:ascii="Microsoft Sans Serif" w:hAnsi="Microsoft Sans Serif" w:cs="Microsoft Sans Serif"/>
+                  </w:rPr>
+                  <w:t>Proposal_ID</w:t>
+                </w:r>
+                <w:proofErr w:type="spellEnd"/>
+              </w:sdtContent>
+            </w:sdt>
+            <w:r>
+              <w:rPr>
+                <w:rFonts w:ascii="Microsoft Sans Serif" w:hAnsi="Microsoft Sans Serif" w:cs="Microsoft Sans Serif"/>
+              </w:rPr>
+              <w:tab/>
+            </w:r>
+          </w:p>
+        </w:tc>
+        <w:tc>
+          <w:tcPr>
+            <w:tcW w:w="1351" w:type="dxa"/>
+            <w:gridSpan w:val="2"/>
+            <w:tcBorders>
+              <w:top w:val="nil"/>
+              <w:left w:val="nil"/>
+              <w:bottom w:val="nil"/>
+              <w:right w:val="single" w:sz="12" w:space="0" w:color="D0CECE" w:themeColor="background2" w:themeShade="E6"/>
+            </w:tcBorders>
+            <w:shd w:val="clear" w:color="auto" w:fill="FFFFFF" w:themeFill="background1"/>
+          </w:tcPr>
+          <w:p>
+            <w:pPr>
+              <w:jc w:val="right"/>
+              <w:rPr>
+                <w:rFonts w:ascii="Microsoft Sans Serif" w:hAnsi="Microsoft Sans Serif" w:cs="Microsoft Sans Serif"/>
+              </w:rPr>
+            </w:pPr>
+            <w:proofErr w:type="spellStart"/>
+            <w:r>
+              <w:rPr>
+                <w:rFonts w:ascii="Microsoft Sans Serif" w:hAnsi="Microsoft Sans Serif" w:cs="Microsoft Sans Serif"/>
+                <w:color w:val="002060"/>
+              </w:rPr>
+              <w:t>معرف</w:t>
+            </w:r>
+            <w:proofErr w:type="spellEnd"/>
+            <w:r>
+              <w:rPr>
+                <w:rFonts w:ascii="Microsoft Sans Serif" w:hAnsi="Microsoft Sans Serif" w:cs="Microsoft Sans Serif"/>
+                <w:color w:val="002060"/>
+              </w:rPr>
+              <w:t xml:space="preserve"> </w:t>
+            </w:r>
+            <w:proofErr w:type="spellStart"/>
+            <w:r>
+              <w:rPr>
+                <w:rFonts w:ascii="Microsoft Sans Serif" w:hAnsi="Microsoft Sans Serif" w:cs="Microsoft Sans Serif"/>
+                <w:color w:val="002060"/>
+              </w:rPr>
+              <w:t>الاقتراح</w:t>
+            </w:r>
+            <w:proofErr w:type="spellEnd"/>
+          </w:p>
+        </w:tc>
+      </w:tr>
+      <w:tr>
+        <w:trPr>
+          <w:trHeight w:val="189"/>
+        </w:trPr>
+        <w:tc>
+          <w:tcPr>
+            <w:tcW w:w="8926" w:type="dxa"/>
+            <w:gridSpan w:val="4"/>
+            <w:tcBorders>
+              <w:top w:val="nil"/>
+              <w:left w:val="single" w:sz="12" w:space="0" w:color="D0CECE" w:themeColor="background2" w:themeShade="E6"/>
+              <w:bottom w:val="nil"/>
+              <w:right w:val="nil"/>
+            </w:tcBorders>
+            <w:shd w:val="clear" w:color="auto" w:fill="FFFFFF" w:themeFill="background1"/>
+          </w:tcPr>
+          <w:p>
+            <w:pPr>
+              <w:tabs>
+                <w:tab w:val="left" w:pos="7248"/>
+              </w:tabs>
+              <w:rPr>
+                <w:rFonts w:ascii="Microsoft Sans Serif" w:hAnsi="Microsoft Sans Serif" w:cs="Microsoft Sans Serif"/>
+                <w:color w:val="002060"/>
+              </w:rPr>
+            </w:pPr>
+            <w:r>
+              <w:rPr>
+                <w:rFonts w:ascii="Microsoft Sans Serif" w:hAnsi="Microsoft Sans Serif" w:cs="Microsoft Sans Serif"/>
+                <w:noProof/>
+                <w:color w:val="002060"/>
+              </w:rPr>
+              <mc:AlternateContent>
+                <mc:Choice Requires="wps">
+                  <w:drawing>
+                    <wp:anchor distT="0" distB="0" distL="114300" distR="114300" simplePos="0" relativeHeight="251754496" behindDoc="0" locked="0" layoutInCell="1" allowOverlap="1" wp14:anchorId="67D25D6E" wp14:editId="6121EBB8">
+                      <wp:simplePos x="0" y="0"/>
+                      <wp:positionH relativeFrom="column">
+                        <wp:posOffset>1247140</wp:posOffset>
+                      </wp:positionH>
+                      <wp:positionV relativeFrom="paragraph">
+                        <wp:posOffset>172085</wp:posOffset>
+                      </wp:positionV>
+                      <wp:extent cx="4495800" cy="0"/>
+                      <wp:effectExtent l="0" t="0" r="0" b="0"/>
+                      <wp:wrapNone/>
+                      <wp:docPr id="1125190833" name="Straight Connector 112"/>
+                      <wp:cNvGraphicFramePr/>
+                      <a:graphic xmlns:a="http://schemas.openxmlformats.org/drawingml/2006/main">
+                        <a:graphicData uri="http://schemas.microsoft.com/office/word/2010/wordprocessingShape">
+                          <wps:wsp>
+                            <wps:cNvCnPr/>
+                            <wps:spPr>
+                              <a:xfrm flipV="1">
+                                <a:off x="0" y="0"/>
+                                <a:ext cx="4495800" cy="0"/>
+                              </a:xfrm>
+                              <a:prstGeom prst="line">
+                                <a:avLst/>
+                              </a:prstGeom>
+                              <a:ln w="9525" cap="flat" cmpd="sng" algn="ctr">
+                                <a:solidFill>
+                                  <a:schemeClr val="bg2">
+                                    <a:lumMod val="90000"/>
+                                  </a:schemeClr>
+                                </a:solidFill>
+                                <a:prstDash val="dash"/>
+                                <a:round/>
+                                <a:headEnd type="none" w="med" len="med"/>
+                                <a:tailEnd type="none" w="med" len="med"/>
+                              </a:ln>
+                            </wps:spPr>
+                            <wps:style>
+                              <a:lnRef idx="0">
+                                <a:scrgbClr r="0" g="0" b="0"/>
+                              </a:lnRef>
+                              <a:fillRef idx="0">
+                                <a:scrgbClr r="0" g="0" b="0"/>
+                              </a:fillRef>
+                              <a:effectRef idx="0">
+                                <a:scrgbClr r="0" g="0" b="0"/>
+                              </a:effectRef>
+                              <a:fontRef idx="minor">
+                                <a:schemeClr val="tx1"/>
+                              </a:fontRef>
+                            </wps:style>
+                            <wps:bodyPr/>
+                          </wps:wsp>
+                        </a:graphicData>
+                      </a:graphic>
+                      <wp14:sizeRelH relativeFrom="margin">
+                        <wp14:pctWidth>0</wp14:pctWidth>
+                      </wp14:sizeRelH>
+                      <wp14:sizeRelV relativeFrom="margin">
+                        <wp14:pctHeight>0</wp14:pctHeight>
+                      </wp14:sizeRelV>
+                    </wp:anchor>
+                  </w:drawing>
+                </mc:Choice>
+                <mc:Fallback xmlns:pic="http://schemas.openxmlformats.org/drawingml/2006/picture" xmlns:a14="http://schemas.microsoft.com/office/drawing/2010/main" xmlns:a="http://schemas.openxmlformats.org/drawingml/2006/main">
+                  <w:pict>
+                    <v:line id="Straight Connector 112" style="position:absolute;flip:y;z-index:251754496;visibility:visible;mso-wrap-style:square;mso-width-percent:0;mso-height-percent:0;mso-wrap-distance-left:9pt;mso-wrap-distance-top:0;mso-wrap-distance-right:9pt;mso-wrap-distance-bottom:0;mso-position-horizontal:absolute;mso-position-horizontal-relative:text;mso-position-vertical:absolute;mso-position-vertical-relative:text;mso-width-percent:0;mso-height-percent:0;mso-width-relative:margin;mso-height-relative:margin" o:spid="_x0000_s1026" strokecolor="#cfcdcd [2894]" o:gfxdata="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" from="98.2pt,13.55pt" to="452.2pt,13.55pt" w14:anchorId="4B3A866B">
+                      <v:stroke dashstyle="dash"/>
+                    </v:line>
+                  </w:pict>
+                </mc:Fallback>
+              </mc:AlternateContent>
+            </w:r>
+            <w:r>
+              <w:rPr>
+                <w:rFonts w:ascii="Microsoft Sans Serif" w:hAnsi="Microsoft Sans Serif" w:cs="Microsoft Sans Serif"/>
+                <w:noProof/>
+                <w:color w:val="002060"/>
+                <w:lang w:val="en-US"/>
+              </w:rPr>
+              <w:t>Renewal Proposal ID</w:t>
+            </w:r>
+            <w:r>
+              <w:rPr>
+                <w:rFonts w:ascii="Microsoft Sans Serif" w:hAnsi="Microsoft Sans Serif" w:cs="Microsoft Sans Serif"/>
+                <w:noProof/>
+                <w:color w:val="002060"/>
+                <w:lang w:val="en-US"/>
+              </w:rPr>
+              <w:t xml:space="preserve"> </w:t>
+            </w:r>
+            <w:sdt>
+              <w:sdtPr>
+                <w:rPr>
+                  <w:rFonts w:ascii="Microsoft Sans Serif" w:hAnsi="Microsoft Sans Serif" w:cs="Microsoft Sans Serif"/>
+                  <w:noProof/>
+                </w:rPr>
+                <w:alias w:val="#Nav: /TenancyContract/Renewal_Proposal_ID"/>
+                <w:tag w:val="#Nav: Tenancy_Contract/50101"/>
+                <w:id w:val="-124011516"/>
+                <w:placeholder>
+                  <w:docPart w:val="DefaultPlaceholder_-1854013440"/>
+                </w:placeholder>
+                <w:dataBinding w:prefixMappings="xmlns:ns0='urn:microsoft-dynamics-nav/reports/Tenancy_Contract/50101/'" w:xpath="/ns0:NavWordReportXmlPart[1]/ns0:TenancyContract[1]/ns0:Renewal_Proposal_ID[1]" w:storeItemID="{B8787D49-5AAC-4AAC-A9D8-A7D9793FE4D0}"/>
+                <w:text/>
+              </w:sdtPr>
+              <w:sdtContent>
+                <w:r>
+                  <w:rPr>
+                    <w:rFonts w:ascii="Microsoft Sans Serif" w:hAnsi="Microsoft Sans Serif" w:cs="Microsoft Sans Serif"/>
+                    <w:noProof/>
+                    <w:lang w:val="en-US"/>
+                  </w:rPr>
+                  <w:t>Renewal_Proposal_ID</w:t>
+                </w:r>
+              </w:sdtContent>
+            </w:sdt>
+            <w:r>
+              <w:rPr>
+                <w:rFonts w:ascii="Microsoft Sans Serif" w:hAnsi="Microsoft Sans Serif" w:cs="Microsoft Sans Serif"/>
+                <w:noProof/>
+              </w:rPr>
+              <w:tab/>
+            </w:r>
+          </w:p>
+        </w:tc>
+        <w:tc>
+          <w:tcPr>
+            <w:tcW w:w="1776" w:type="dxa"/>
+            <w:gridSpan w:val="3"/>
+            <w:tcBorders>
+              <w:top w:val="nil"/>
+              <w:left w:val="nil"/>
+              <w:bottom w:val="nil"/>
+              <w:right w:val="single" w:sz="12" w:space="0" w:color="D0CECE" w:themeColor="background2" w:themeShade="E6"/>
+            </w:tcBorders>
+            <w:shd w:val="clear" w:color="auto" w:fill="FFFFFF" w:themeFill="background1"/>
+          </w:tcPr>
+          <w:p>
+            <w:pPr>
+              <w:jc w:val="right"/>
+              <w:rPr>
+                <w:rFonts w:ascii="Microsoft Sans Serif" w:hAnsi="Microsoft Sans Serif" w:cs="Microsoft Sans Serif"/>
+                <w:color w:val="002060"/>
+              </w:rPr>
+            </w:pPr>
+            <w:proofErr w:type="spellStart"/>
+            <w:r>
+              <w:rPr>
+                <w:rFonts w:ascii="Microsoft Sans Serif" w:hAnsi="Microsoft Sans Serif" w:cs="Microsoft Sans Serif"/>
+                <w:color w:val="002060"/>
+              </w:rPr>
+              <w:t>معرف</w:t>
+            </w:r>
+            <w:proofErr w:type="spellEnd"/>
+            <w:r>
+              <w:rPr>
+                <w:rFonts w:ascii="Microsoft Sans Serif" w:hAnsi="Microsoft Sans Serif" w:cs="Microsoft Sans Serif"/>
+                <w:color w:val="002060"/>
+              </w:rPr>
+              <w:t xml:space="preserve"> </w:t>
+            </w:r>
+            <w:proofErr w:type="spellStart"/>
+            <w:r>
+              <w:rPr>
+                <w:rFonts w:ascii="Microsoft Sans Serif" w:hAnsi="Microsoft Sans Serif" w:cs="Microsoft Sans Serif"/>
+                <w:color w:val="002060"/>
+              </w:rPr>
+              <w:t>اقتراح</w:t>
+            </w:r>
+            <w:proofErr w:type="spellEnd"/>
+            <w:r>
+              <w:rPr>
+                <w:rFonts w:ascii="Microsoft Sans Serif" w:hAnsi="Microsoft Sans Serif" w:cs="Microsoft Sans Serif"/>
+                <w:color w:val="002060"/>
+              </w:rPr>
+              <w:t xml:space="preserve"> </w:t>
+            </w:r>
+            <w:proofErr w:type="spellStart"/>
+            <w:r>
+              <w:rPr>
+                <w:rFonts w:ascii="Microsoft Sans Serif" w:hAnsi="Microsoft Sans Serif" w:cs="Microsoft Sans Serif"/>
+                <w:color w:val="002060"/>
+              </w:rPr>
+              <w:t>التجديد</w:t>
+            </w:r>
+            <w:proofErr w:type="spellEnd"/>
+          </w:p>
+        </w:tc>
+      </w:tr>
+    </w:tbl>
+    <w:p>
+      <w:pPr>
+        <w:pStyle w:val="BodyText"/>
+        <w:rPr>
+          <w:rFonts w:ascii="Times New Roman"/>
+          <w:sz w:val="20"/>
+        </w:rPr>
+      </w:pPr>
+    </w:p>
+    <w:p>
+      <w:pPr>
+        <w:pStyle w:val="BodyText"/>
+        <w:rPr>
+          <w:rFonts w:ascii="Times New Roman"/>
+          <w:sz w:val="20"/>
+        </w:rPr>
+      </w:pPr>
+    </w:p>
     <w:p>
       <w:pPr>
         <w:pStyle w:val="BodyText"/>
@@ -2689,8 +3605,58 @@
           <w:rFonts w:ascii="Times New Roman"/>
           <w:sz w:val="20"/>
         </w:rPr>
-        <w:t xml:space="preserve">         </w:t>
+        <w:t xml:space="preserve">   </w:t>
       </w:r>
+    </w:p>
+    <w:p>
+      <w:pPr>
+        <w:pStyle w:val="BodyText"/>
+        <w:rPr>
+          <w:rFonts w:ascii="Times New Roman"/>
+          <w:sz w:val="20"/>
+        </w:rPr>
+      </w:pPr>
+      <w:r>
+        <w:rPr>
+          <w:rFonts w:ascii="Times New Roman"/>
+          <w:sz w:val="20"/>
+        </w:rPr>
+        <w:t xml:space="preserve">    </w:t>
+      </w:r>
+    </w:p>
+    <w:p>
+      <w:pPr>
+        <w:pStyle w:val="BodyText"/>
+        <w:rPr>
+          <w:rFonts w:ascii="Times New Roman"/>
+          <w:sz w:val="20"/>
+        </w:rPr>
+      </w:pPr>
+      <w:r>
+        <w:rPr>
+          <w:rFonts w:ascii="Times New Roman"/>
+          <w:sz w:val="20"/>
+        </w:rPr>
+        <w:t xml:space="preserve"> </w:t>
+      </w:r>
+    </w:p>
+    <w:p>
+      <w:pPr>
+        <w:pStyle w:val="BodyText"/>
+        <w:rPr>
+          <w:rFonts w:ascii="Times New Roman"/>
+          <w:sz w:val="20"/>
+        </w:rPr>
+      </w:pPr>
+    </w:p>
+    <w:p>
+      <w:pPr>
+        <w:pStyle w:val="BodyText"/>
+        <w:rPr>
+          <w:rFonts w:ascii="Times New Roman"/>
+          <w:sz w:val="20"/>
+        </w:rPr>
+      </w:pPr>
     </w:p>
     <w:p>
       <w:pPr>
@@ -2707,6 +3673,15 @@
         </w:rPr>
         <w:tab/>
       </w:r>
+    </w:p>
+    <w:p>
+      <w:pPr>
+        <w:pStyle w:val="BodyText"/>
+        <w:rPr>
+          <w:rFonts w:ascii="Times New Roman"/>
+          <w:sz w:val="20"/>
+        </w:rPr>
+      </w:pPr>
     </w:p>
     <w:p>
       <w:pPr>
@@ -3453,12 +4428,7 @@
           <w:sz w:val="20"/>
         </w:rPr>
         <w:sectPr>
-          <w:headerReference w:type="even" r:id="rId21"/>
-          <w:headerReference w:type="default" r:id="rId22"/>
-          <w:footerReference w:type="even" r:id="rId23"/>
-          <w:footerReference w:type="default" r:id="rId24"/>
-          <w:headerReference w:type="first" r:id="rId25"/>
-          <w:footerReference w:type="first" r:id="rId26"/>
+          <w:headerReference w:type="default" r:id="rId21"/>
           <w:pgSz w:w="11920" w:h="16840"/>
           <w:pgMar w:top="1660" w:right="0" w:bottom="280" w:left="0" w:header="580" w:footer="720" w:gutter="0"/>
           <w:pgNumType w:start="1"/>
@@ -4992,7 +5962,7 @@
               </wp:anchor>
             </w:drawing>
           </mc:Choice>
-          <mc:Fallback xmlns:a="http://schemas.openxmlformats.org/drawingml/2006/main" xmlns:a14="http://schemas.microsoft.com/office/drawing/2010/main" xmlns:pic="http://schemas.openxmlformats.org/drawingml/2006/picture">
+          <mc:Fallback xmlns:pic="http://schemas.openxmlformats.org/drawingml/2006/picture" xmlns:a14="http://schemas.microsoft.com/office/drawing/2010/main" xmlns:a="http://schemas.openxmlformats.org/drawingml/2006/main">
             <w:pict>
               <v:rect id="Rectangle 98" style="position:absolute;margin-left:67.5pt;margin-top:521.55pt;width:2pt;height:.2pt;z-index:-251657216;visibility:visible;mso-wrap-style:square;mso-width-percent:0;mso-height-percent:0;mso-wrap-distance-left:9pt;mso-wrap-distance-top:0;mso-wrap-distance-right:9pt;mso-wrap-distance-bottom:0;mso-position-horizontal:absolute;mso-position-horizontal-relative:page;mso-position-vertical:absolute;mso-position-vertical-relative:page;mso-width-percent:0;mso-height-percent:0;mso-width-relative:page;mso-height-relative:page;v-text-anchor:top" o:spid="_x0000_s1026" fillcolor="#9d9d9d" stroked="f" o:gfxdata="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" w14:anchorId="3EF27AD4">
                 <w10:wrap anchorx="page" anchory="page"/>
@@ -5072,7 +6042,7 @@
               </wp:anchor>
             </w:drawing>
           </mc:Choice>
-          <mc:Fallback xmlns:a="http://schemas.openxmlformats.org/drawingml/2006/main" xmlns:a14="http://schemas.microsoft.com/office/drawing/2010/main" xmlns:pic="http://schemas.openxmlformats.org/drawingml/2006/picture">
+          <mc:Fallback xmlns:pic="http://schemas.openxmlformats.org/drawingml/2006/picture" xmlns:a14="http://schemas.microsoft.com/office/drawing/2010/main" xmlns:a="http://schemas.openxmlformats.org/drawingml/2006/main">
             <w:pict>
               <v:rect id="Rectangle 97" style="position:absolute;margin-left:198.5pt;margin-top:804.55pt;width:2pt;height:.2pt;z-index:-251656192;visibility:visible;mso-wrap-style:square;mso-width-percent:0;mso-height-percent:0;mso-wrap-distance-left:9pt;mso-wrap-distance-top:0;mso-wrap-distance-right:9pt;mso-wrap-distance-bottom:0;mso-position-horizontal:absolute;mso-position-horizontal-relative:page;mso-position-vertical:absolute;mso-position-vertical-relative:page;mso-width-percent:0;mso-height-percent:0;mso-width-relative:page;mso-height-relative:page;v-text-anchor:top" o:spid="_x0000_s1026" fillcolor="#9d9d9d" stroked="f" o:gfxdata="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" w14:anchorId="663D5ECD">
                 <w10:wrap anchorx="page" anchory="page"/>
@@ -5152,7 +6122,7 @@
               </wp:anchor>
             </w:drawing>
           </mc:Choice>
-          <mc:Fallback xmlns:a="http://schemas.openxmlformats.org/drawingml/2006/main" xmlns:a14="http://schemas.microsoft.com/office/drawing/2010/main" xmlns:pic="http://schemas.openxmlformats.org/drawingml/2006/picture">
+          <mc:Fallback xmlns:pic="http://schemas.openxmlformats.org/drawingml/2006/picture" xmlns:a14="http://schemas.microsoft.com/office/drawing/2010/main" xmlns:a="http://schemas.openxmlformats.org/drawingml/2006/main">
             <w:pict>
               <v:rect id="Rectangle 96" style="position:absolute;margin-left:471.5pt;margin-top:804.55pt;width:2pt;height:.2pt;z-index:-251655168;visibility:visible;mso-wrap-style:square;mso-width-percent:0;mso-height-percent:0;mso-wrap-distance-left:9pt;mso-wrap-distance-top:0;mso-wrap-distance-right:9pt;mso-wrap-distance-bottom:0;mso-position-horizontal:absolute;mso-position-horizontal-relative:page;mso-position-vertical:absolute;mso-position-vertical-relative:page;mso-width-percent:0;mso-height-percent:0;mso-width-relative:page;mso-height-relative:page;v-text-anchor:top" o:spid="_x0000_s1026" fillcolor="#9d9d9d" stroked="f" o:gfxdata="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" w14:anchorId="4158125D">
                 <w10:wrap anchorx="page" anchory="page"/>
@@ -5386,7 +6356,7 @@
               </wp:anchor>
             </w:drawing>
           </mc:Choice>
-          <mc:Fallback xmlns:a="http://schemas.openxmlformats.org/drawingml/2006/main" xmlns:a14="http://schemas.microsoft.com/office/drawing/2010/main" xmlns:pic="http://schemas.openxmlformats.org/drawingml/2006/picture">
+          <mc:Fallback xmlns:pic="http://schemas.openxmlformats.org/drawingml/2006/picture" xmlns:a14="http://schemas.microsoft.com/office/drawing/2010/main" xmlns:a="http://schemas.openxmlformats.org/drawingml/2006/main">
             <w:pict>
               <v:line id="Straight Connector 230" style="position:absolute;flip:y;z-index:251679744;visibility:visible;mso-wrap-style:square;mso-width-percent:0;mso-height-percent:0;mso-wrap-distance-left:9pt;mso-wrap-distance-top:0;mso-wrap-distance-right:9pt;mso-wrap-distance-bottom:0;mso-position-horizontal:absolute;mso-position-horizontal-relative:text;mso-position-vertical:absolute;mso-position-vertical-relative:text;mso-width-percent:0;mso-height-percent:0;mso-width-relative:margin;mso-height-relative:margin" o:spid="_x0000_s1026" strokecolor="silver" o:gfxdata="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" from="104.65pt,2.65pt" to="517.15pt,2.65pt" w14:anchorId="32535D83">
                 <v:stroke dashstyle="dash"/>
@@ -5641,7 +6611,7 @@
               </wp:anchor>
             </w:drawing>
           </mc:Choice>
-          <mc:Fallback xmlns:a="http://schemas.openxmlformats.org/drawingml/2006/main" xmlns:a14="http://schemas.microsoft.com/office/drawing/2010/main" xmlns:pic="http://schemas.openxmlformats.org/drawingml/2006/picture">
+          <mc:Fallback xmlns:pic="http://schemas.openxmlformats.org/drawingml/2006/picture" xmlns:a14="http://schemas.microsoft.com/office/drawing/2010/main" xmlns:a="http://schemas.openxmlformats.org/drawingml/2006/main">
             <w:pict>
               <v:line id="Straight Connector 232" style="position:absolute;flip:y;z-index:251680768;visibility:visible;mso-wrap-style:square;mso-width-percent:0;mso-height-percent:0;mso-wrap-distance-left:9pt;mso-wrap-distance-top:0;mso-wrap-distance-right:9pt;mso-wrap-distance-bottom:0;mso-position-horizontal:absolute;mso-position-horizontal-relative:text;mso-position-vertical:absolute;mso-position-vertical-relative:text;mso-width-percent:0;mso-height-percent:0;mso-width-relative:margin;mso-height-relative:margin" o:spid="_x0000_s1026" strokecolor="silver" o:gfxdata="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" from="105.4pt,3.55pt" to="526.9pt,4.7pt" w14:anchorId="18254DBF">
                 <v:stroke dashstyle="dash"/>
@@ -5842,7 +6812,7 @@
               </wp:anchor>
             </w:drawing>
           </mc:Choice>
-          <mc:Fallback xmlns:a="http://schemas.openxmlformats.org/drawingml/2006/main" xmlns:a14="http://schemas.microsoft.com/office/drawing/2010/main" xmlns:pic="http://schemas.openxmlformats.org/drawingml/2006/picture">
+          <mc:Fallback xmlns:pic="http://schemas.openxmlformats.org/drawingml/2006/picture" xmlns:a14="http://schemas.microsoft.com/office/drawing/2010/main" xmlns:a="http://schemas.openxmlformats.org/drawingml/2006/main">
             <w:pict>
               <v:line id="Straight Connector 233" style="position:absolute;flip:y;z-index:251681792;visibility:visible;mso-wrap-style:square;mso-width-percent:0;mso-height-percent:0;mso-wrap-distance-left:9pt;mso-wrap-distance-top:0;mso-wrap-distance-right:9pt;mso-wrap-distance-bottom:0;mso-position-horizontal:absolute;mso-position-horizontal-relative:text;mso-position-vertical:absolute;mso-position-vertical-relative:text;mso-width-percent:0;mso-height-percent:0;mso-width-relative:margin;mso-height-relative:margin" o:spid="_x0000_s1026" strokecolor="silver" o:gfxdata="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" from="127.6pt,25.05pt" to="490.6pt,27.55pt" w14:anchorId="113D1DDF">
                 <v:stroke dashstyle="dash"/>
@@ -6484,7 +7454,7 @@
               </wp:anchor>
             </w:drawing>
           </mc:Choice>
-          <mc:Fallback xmlns:a="http://schemas.openxmlformats.org/drawingml/2006/main" xmlns:a14="http://schemas.microsoft.com/office/drawing/2010/main" xmlns:pic="http://schemas.openxmlformats.org/drawingml/2006/picture">
+          <mc:Fallback xmlns:pic="http://schemas.openxmlformats.org/drawingml/2006/picture" xmlns:a14="http://schemas.microsoft.com/office/drawing/2010/main" xmlns:a="http://schemas.openxmlformats.org/drawingml/2006/main">
             <w:pict>
               <v:line id="Straight Connector 235" style="position:absolute;z-index:251683840;visibility:visible;mso-wrap-style:square;mso-width-percent:0;mso-height-percent:0;mso-wrap-distance-left:9pt;mso-wrap-distance-top:0;mso-wrap-distance-right:9pt;mso-wrap-distance-bottom:0;mso-position-horizontal:absolute;mso-position-horizontal-relative:text;mso-position-vertical:absolute;mso-position-vertical-relative:text;mso-width-percent:0;mso-height-percent:0;mso-width-relative:margin;mso-height-relative:margin" o:spid="_x0000_s1026" strokecolor="silver" o:gfxdata="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" from="84.75pt,9.15pt" to="3in,9.15pt" w14:anchorId="26ED0323">
                 <v:stroke dashstyle="dash"/>
@@ -6564,7 +7534,7 @@
               </wp:anchor>
             </w:drawing>
           </mc:Choice>
-          <mc:Fallback xmlns:a="http://schemas.openxmlformats.org/drawingml/2006/main" xmlns:a14="http://schemas.microsoft.com/office/drawing/2010/main" xmlns:pic="http://schemas.openxmlformats.org/drawingml/2006/picture">
+          <mc:Fallback xmlns:pic="http://schemas.openxmlformats.org/drawingml/2006/picture" xmlns:a14="http://schemas.microsoft.com/office/drawing/2010/main" xmlns:a="http://schemas.openxmlformats.org/drawingml/2006/main">
             <w:pict>
               <v:line id="Straight Connector 237" style="position:absolute;flip:y;z-index:251685888;visibility:visible;mso-wrap-style:square;mso-width-percent:0;mso-height-percent:0;mso-wrap-distance-left:9pt;mso-wrap-distance-top:0;mso-wrap-distance-right:9pt;mso-wrap-distance-bottom:0;mso-position-horizontal:absolute;mso-position-horizontal-relative:text;mso-position-vertical:absolute;mso-position-vertical-relative:text;mso-width-percent:0;mso-height-percent:0;mso-width-relative:margin;mso-height-relative:margin" o:spid="_x0000_s1026" strokecolor="silver" o:gfxdata="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" from="357pt,8.45pt" to="496.8pt,8.85pt" w14:anchorId="60B20738">
                 <v:stroke dashstyle="dash"/>
@@ -6823,7 +7793,7 @@
               </wp:anchor>
             </w:drawing>
           </mc:Choice>
-          <mc:Fallback xmlns:a="http://schemas.openxmlformats.org/drawingml/2006/main" xmlns:a14="http://schemas.microsoft.com/office/drawing/2010/main" xmlns:pic="http://schemas.openxmlformats.org/drawingml/2006/picture">
+          <mc:Fallback xmlns:pic="http://schemas.openxmlformats.org/drawingml/2006/picture" xmlns:a14="http://schemas.microsoft.com/office/drawing/2010/main" xmlns:a="http://schemas.openxmlformats.org/drawingml/2006/main">
             <w:pict>
               <v:line id="Straight Connector 240" style="position:absolute;z-index:251687936;visibility:visible;mso-wrap-style:square;mso-width-percent:0;mso-height-percent:0;mso-wrap-distance-left:9pt;mso-wrap-distance-top:0;mso-wrap-distance-right:9pt;mso-wrap-distance-bottom:0;mso-position-horizontal:absolute;mso-position-horizontal-relative:text;mso-position-vertical:absolute;mso-position-vertical-relative:text;mso-width-percent:0;mso-height-percent:0;mso-width-relative:margin;mso-height-relative:margin" o:spid="_x0000_s1026" strokecolor="silver" o:gfxdata="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" from="99pt,11.7pt" to="459.7pt,12.1pt" w14:anchorId="65B5EF80">
                 <v:stroke dashstyle="dash"/>
@@ -6911,7 +7881,7 @@
               </wp:anchor>
             </w:drawing>
           </mc:Choice>
-          <mc:Fallback xmlns:a="http://schemas.openxmlformats.org/drawingml/2006/main" xmlns:a14="http://schemas.microsoft.com/office/drawing/2010/main" xmlns:pic="http://schemas.openxmlformats.org/drawingml/2006/picture">
+          <mc:Fallback xmlns:pic="http://schemas.openxmlformats.org/drawingml/2006/picture" xmlns:a14="http://schemas.microsoft.com/office/drawing/2010/main" xmlns:a="http://schemas.openxmlformats.org/drawingml/2006/main">
             <w:pict>
               <v:line id="Straight Connector 242" style="position:absolute;z-index:251689984;visibility:visible;mso-wrap-style:square;mso-width-percent:0;mso-height-percent:0;mso-wrap-distance-left:9pt;mso-wrap-distance-top:0;mso-wrap-distance-right:9pt;mso-wrap-distance-bottom:0;mso-position-horizontal:absolute;mso-position-horizontal-relative:text;mso-position-vertical:absolute;mso-position-vertical-relative:text;mso-width-percent:0;mso-height-percent:0;mso-width-relative:margin;mso-height-relative:margin" o:spid="_x0000_s1026" strokecolor="silver" o:gfxdata="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" from="105.4pt,13.05pt" to="495pt,13.05pt" w14:anchorId="5E23C785">
                 <v:stroke dashstyle="dash"/>
@@ -8472,7 +9442,7 @@
               </wp:anchor>
             </w:drawing>
           </mc:Choice>
-          <mc:Fallback xmlns:a="http://schemas.openxmlformats.org/drawingml/2006/main" xmlns:a14="http://schemas.microsoft.com/office/drawing/2010/main" xmlns:pic="http://schemas.openxmlformats.org/drawingml/2006/picture">
+          <mc:Fallback xmlns:pic="http://schemas.openxmlformats.org/drawingml/2006/picture" xmlns:a14="http://schemas.microsoft.com/office/drawing/2010/main" xmlns:a="http://schemas.openxmlformats.org/drawingml/2006/main">
             <w:pict>
               <v:line id="Straight Connector 282" style="position:absolute;flip:y;z-index:251708416;visibility:visible;mso-wrap-style:square;mso-width-percent:0;mso-height-percent:0;mso-wrap-distance-left:9pt;mso-wrap-distance-top:0;mso-wrap-distance-right:9pt;mso-wrap-distance-bottom:0;mso-position-horizontal:absolute;mso-position-horizontal-relative:text;mso-position-vertical:absolute;mso-position-vertical-relative:text;mso-width-percent:0;mso-height-percent:0;mso-width-relative:margin;mso-height-relative:margin" o:spid="_x0000_s1026" strokecolor="silver" o:gfxdata="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" from="104.25pt,139.25pt" to="504.4pt,141.15pt" w14:anchorId="486B6538">
                 <v:stroke dashstyle="dash"/>
@@ -8747,7 +9717,7 @@
               </wp:anchor>
             </w:drawing>
           </mc:Choice>
-          <mc:Fallback xmlns:a="http://schemas.openxmlformats.org/drawingml/2006/main" xmlns:a14="http://schemas.microsoft.com/office/drawing/2010/main" xmlns:pic="http://schemas.openxmlformats.org/drawingml/2006/picture">
+          <mc:Fallback xmlns:pic="http://schemas.openxmlformats.org/drawingml/2006/picture" xmlns:a14="http://schemas.microsoft.com/office/drawing/2010/main" xmlns:a="http://schemas.openxmlformats.org/drawingml/2006/main">
             <w:pict>
               <v:line id="Straight Connector 279" style="position:absolute;flip:y;z-index:251705344;visibility:visible;mso-wrap-style:square;mso-width-percent:0;mso-height-percent:0;mso-wrap-distance-left:9pt;mso-wrap-distance-top:0;mso-wrap-distance-right:9pt;mso-wrap-distance-bottom:0;mso-position-horizontal:absolute;mso-position-horizontal-relative:text;mso-position-vertical:absolute;mso-position-vertical-relative:text;mso-width-percent:0;mso-height-percent:0;mso-width-relative:margin;mso-height-relative:margin" o:spid="_x0000_s1026" strokecolor="silver" o:gfxdata="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" from="99.75pt,117.85pt" to="485.65pt,118.6pt" w14:anchorId="5BB12C44">
                 <v:stroke dashstyle="dash"/>
@@ -9073,7 +10043,7 @@
               </wp:anchor>
             </w:drawing>
           </mc:Choice>
-          <mc:Fallback xmlns:a="http://schemas.openxmlformats.org/drawingml/2006/main" xmlns:a14="http://schemas.microsoft.com/office/drawing/2010/main" xmlns:pic="http://schemas.openxmlformats.org/drawingml/2006/picture">
+          <mc:Fallback xmlns:pic="http://schemas.openxmlformats.org/drawingml/2006/picture" xmlns:a14="http://schemas.microsoft.com/office/drawing/2010/main" xmlns:a="http://schemas.openxmlformats.org/drawingml/2006/main">
             <w:pict>
               <v:line id="Straight Connector 278" style="position:absolute;flip:y;z-index:251704320;visibility:visible;mso-wrap-style:square;mso-width-percent:0;mso-height-percent:0;mso-wrap-distance-left:9pt;mso-wrap-distance-top:0;mso-wrap-distance-right:9pt;mso-wrap-distance-bottom:0;mso-position-horizontal:absolute;mso-position-horizontal-relative:text;mso-position-vertical:absolute;mso-position-vertical-relative:text;mso-width-percent:0;mso-height-percent:0;mso-width-relative:margin;mso-height-relative:margin" o:spid="_x0000_s1026" strokecolor="silver" o:gfxdata="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" from="350.65pt,96.1pt" to="501pt,96.8pt" w14:anchorId="371A2695">
                 <v:stroke dashstyle="dash"/>
@@ -9154,7 +10124,7 @@
               </wp:anchor>
             </w:drawing>
           </mc:Choice>
-          <mc:Fallback xmlns:a="http://schemas.openxmlformats.org/drawingml/2006/main" xmlns:a14="http://schemas.microsoft.com/office/drawing/2010/main" xmlns:pic="http://schemas.openxmlformats.org/drawingml/2006/picture">
+          <mc:Fallback xmlns:pic="http://schemas.openxmlformats.org/drawingml/2006/picture" xmlns:a14="http://schemas.microsoft.com/office/drawing/2010/main" xmlns:a="http://schemas.openxmlformats.org/drawingml/2006/main">
             <w:pict>
               <v:line id="Straight Connector 277" style="position:absolute;z-index:251703296;visibility:visible;mso-wrap-style:square;mso-width-percent:0;mso-height-percent:0;mso-wrap-distance-left:9pt;mso-wrap-distance-top:0;mso-wrap-distance-right:9pt;mso-wrap-distance-bottom:0;mso-position-horizontal:absolute;mso-position-horizontal-relative:text;mso-position-vertical:absolute;mso-position-vertical-relative:text;mso-width-percent:0;mso-height-percent:0;mso-width-relative:margin;mso-height-relative:margin" o:spid="_x0000_s1026" strokecolor="silver" o:gfxdata="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" from="86.6pt,97.25pt" to="202.85pt,97.65pt" w14:anchorId="3A887180">
                 <v:stroke dashstyle="dash"/>
@@ -9379,7 +10349,7 @@
               </wp:anchor>
             </w:drawing>
           </mc:Choice>
-          <mc:Fallback xmlns:a="http://schemas.openxmlformats.org/drawingml/2006/main" xmlns:a14="http://schemas.microsoft.com/office/drawing/2010/main" xmlns:pic="http://schemas.openxmlformats.org/drawingml/2006/picture">
+          <mc:Fallback xmlns:pic="http://schemas.openxmlformats.org/drawingml/2006/picture" xmlns:a14="http://schemas.microsoft.com/office/drawing/2010/main" xmlns:a="http://schemas.openxmlformats.org/drawingml/2006/main">
             <w:pict>
               <v:line id="Straight Connector 272" style="position:absolute;flip:y;z-index:251698176;visibility:visible;mso-wrap-style:square;mso-width-percent:0;mso-height-percent:0;mso-wrap-distance-left:9pt;mso-wrap-distance-top:0;mso-wrap-distance-right:9pt;mso-wrap-distance-bottom:0;mso-position-horizontal:absolute;mso-position-horizontal-relative:text;mso-position-vertical:absolute;mso-position-vertical-relative:text;mso-width-percent:0;mso-height-percent:0;mso-width-relative:margin;mso-height-relative:margin" o:spid="_x0000_s1026" strokecolor="silver" o:gfxdata="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" from="130.15pt,70.65pt" to="475.5pt,71.8pt" w14:anchorId="10DE1305">
                 <v:stroke dashstyle="dash"/>
@@ -9706,9 +10676,9 @@
               </wp:anchor>
             </w:drawing>
           </mc:Choice>
-          <mc:Fallback>
+          <mc:Fallback xmlns:a="http://schemas.openxmlformats.org/drawingml/2006/main" xmlns:a14="http://schemas.microsoft.com/office/drawing/2010/main" xmlns:pic="http://schemas.openxmlformats.org/drawingml/2006/picture">
             <w:pict>
-              <v:line w14:anchorId="6FF8CCCE" id="Straight Connector 270" o:spid="_x0000_s1026" style="position:absolute;flip:y;z-index:251696128;visibility:visible;mso-wrap-style:square;mso-width-percent:0;mso-height-percent:0;mso-wrap-distance-left:9pt;mso-wrap-distance-top:0;mso-wrap-distance-right:9pt;mso-wrap-distance-bottom:0;mso-position-horizontal:absolute;mso-position-horizontal-relative:text;mso-position-vertical:absolute;mso-position-vertical-relative:text;mso-width-percent:0;mso-height-percent:0;mso-width-relative:margin;mso-height-relative:margin" from="105.4pt,50.75pt" to="512.65pt,52.2pt" o:gfxdata="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" strokecolor="silver">
+              <v:line id="Straight Connector 270" style="position:absolute;flip:y;z-index:251696128;visibility:visible;mso-wrap-style:square;mso-width-percent:0;mso-height-percent:0;mso-wrap-distance-left:9pt;mso-wrap-distance-top:0;mso-wrap-distance-right:9pt;mso-wrap-distance-bottom:0;mso-position-horizontal:absolute;mso-position-horizontal-relative:text;mso-position-vertical:absolute;mso-position-vertical-relative:text;mso-width-percent:0;mso-height-percent:0;mso-width-relative:margin;mso-height-relative:margin" o:spid="_x0000_s1026" strokecolor="silver" o:gfxdata="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" from="105.4pt,50.75pt" to="512.65pt,52.2pt" w14:anchorId="6FF8CCCE">
                 <v:stroke dashstyle="dash"/>
               </v:line>
             </w:pict>
@@ -9990,6 +10960,9 @@
           <w:tcPr>
             <w:tcW w:w="5240" w:type="dxa"/>
             <w:gridSpan w:val="4"/>
+            <w:tcBorders>
+              <w:right w:val="nil"/>
+            </w:tcBorders>
             <w:shd w:val="clear" w:color="auto" w:fill="002060"/>
           </w:tcPr>
           <w:p>
@@ -10002,6 +10975,9 @@
           <w:tcPr>
             <w:tcW w:w="5462" w:type="dxa"/>
             <w:gridSpan w:val="5"/>
+            <w:tcBorders>
+              <w:left w:val="nil"/>
+            </w:tcBorders>
             <w:shd w:val="clear" w:color="auto" w:fill="002060"/>
           </w:tcPr>
           <w:p>
@@ -10124,7 +11100,7 @@
                     </wp:anchor>
                   </w:drawing>
                 </mc:Choice>
-                <mc:Fallback xmlns:pic="http://schemas.openxmlformats.org/drawingml/2006/picture" xmlns:a14="http://schemas.microsoft.com/office/drawing/2010/main" xmlns:a="http://schemas.openxmlformats.org/drawingml/2006/main">
+                <mc:Fallback xmlns:a="http://schemas.openxmlformats.org/drawingml/2006/main" xmlns:a14="http://schemas.microsoft.com/office/drawing/2010/main" xmlns:pic="http://schemas.openxmlformats.org/drawingml/2006/picture">
                   <w:pict>
                     <v:line id="Straight Connector 111" style="position:absolute;flip:y;z-index:251738112;visibility:visible;mso-wrap-style:square;mso-wrap-distance-left:9pt;mso-wrap-distance-top:0;mso-wrap-distance-right:9pt;mso-wrap-distance-bottom:0;mso-position-horizontal:absolute;mso-position-horizontal-relative:text;mso-position-vertical:absolute;mso-position-vertical-relative:text" o:spid="_x0000_s1026" strokecolor="#cfcdcd [2894]" o:gfxdata="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" from="78.15pt,11.75pt" to="467.15pt,12.25pt" w14:anchorId="66C3FF8F">
                       <v:stroke dashstyle="dash"/>
@@ -10323,7 +11299,7 @@
                     </wp:anchor>
                   </w:drawing>
                 </mc:Choice>
-                <mc:Fallback xmlns:pic="http://schemas.openxmlformats.org/drawingml/2006/picture" xmlns:a14="http://schemas.microsoft.com/office/drawing/2010/main" xmlns:a="http://schemas.openxmlformats.org/drawingml/2006/main">
+                <mc:Fallback xmlns:a="http://schemas.openxmlformats.org/drawingml/2006/main" xmlns:a14="http://schemas.microsoft.com/office/drawing/2010/main" xmlns:pic="http://schemas.openxmlformats.org/drawingml/2006/picture">
                   <w:pict>
                     <v:line id="Straight Connector 112" style="position:absolute;flip:y;z-index:251739136;visibility:visible;mso-wrap-style:square;mso-wrap-distance-left:9pt;mso-wrap-distance-top:0;mso-wrap-distance-right:9pt;mso-wrap-distance-bottom:0;mso-position-horizontal:absolute;mso-position-horizontal-relative:text;mso-position-vertical:absolute;mso-position-vertical-relative:text" o:spid="_x0000_s1026" strokecolor="#cfcdcd [2894]" o:gfxdata="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" from="38.65pt,12.3pt" to="209.15pt,12.8pt" w14:anchorId="10B9E2DC">
                       <v:stroke dashstyle="dash"/>
@@ -10519,7 +11495,7 @@
                     </wp:anchor>
                   </w:drawing>
                 </mc:Choice>
-                <mc:Fallback xmlns:pic="http://schemas.openxmlformats.org/drawingml/2006/picture" xmlns:a14="http://schemas.microsoft.com/office/drawing/2010/main" xmlns:a="http://schemas.openxmlformats.org/drawingml/2006/main">
+                <mc:Fallback xmlns:a="http://schemas.openxmlformats.org/drawingml/2006/main" xmlns:a14="http://schemas.microsoft.com/office/drawing/2010/main" xmlns:pic="http://schemas.openxmlformats.org/drawingml/2006/picture">
                   <w:pict>
                     <v:line id="Straight Connector 112" style="position:absolute;flip:y;z-index:251740160;visibility:visible;mso-wrap-style:square;mso-width-percent:0;mso-height-percent:0;mso-wrap-distance-left:9pt;mso-wrap-distance-top:0;mso-wrap-distance-right:9pt;mso-wrap-distance-bottom:0;mso-position-horizontal:absolute;mso-position-horizontal-relative:text;mso-position-vertical:absolute;mso-position-vertical-relative:text;mso-width-percent:0;mso-height-percent:0;mso-width-relative:margin;mso-height-relative:margin" o:spid="_x0000_s1026" strokecolor="#cfcdcd [2894]" o:gfxdata="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" from="53.6pt,11.8pt" to="210.1pt,12.3pt" w14:anchorId="5DCB3C89">
                       <v:stroke dashstyle="dash"/>
@@ -10713,7 +11689,7 @@
                     </wp:anchor>
                   </w:drawing>
                 </mc:Choice>
-                <mc:Fallback xmlns:pic="http://schemas.openxmlformats.org/drawingml/2006/picture" xmlns:a14="http://schemas.microsoft.com/office/drawing/2010/main" xmlns:a="http://schemas.openxmlformats.org/drawingml/2006/main">
+                <mc:Fallback xmlns:a="http://schemas.openxmlformats.org/drawingml/2006/main" xmlns:a14="http://schemas.microsoft.com/office/drawing/2010/main" xmlns:pic="http://schemas.openxmlformats.org/drawingml/2006/picture">
                   <w:pict>
                     <v:line id="Straight Connector 112" style="position:absolute;flip:y;z-index:251741184;visibility:visible;mso-wrap-style:square;mso-width-percent:0;mso-height-percent:0;mso-wrap-distance-left:9pt;mso-wrap-distance-top:0;mso-wrap-distance-right:9pt;mso-wrap-distance-bottom:0;mso-position-horizontal:absolute;mso-position-horizontal-relative:text;mso-position-vertical:absolute;mso-position-vertical-relative:text;mso-width-percent:0;mso-height-percent:0;mso-width-relative:margin;mso-height-relative:margin" o:spid="_x0000_s1026" strokecolor="#cfcdcd [2894]" o:gfxdata="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" from="70.15pt,12.35pt" to="217.85pt,12.35pt" w14:anchorId="523D32E8">
                       <v:stroke dashstyle="dash"/>
@@ -10903,7 +11879,7 @@
                     </wp:anchor>
                   </w:drawing>
                 </mc:Choice>
-                <mc:Fallback xmlns:pic="http://schemas.openxmlformats.org/drawingml/2006/picture" xmlns:a14="http://schemas.microsoft.com/office/drawing/2010/main" xmlns:a="http://schemas.openxmlformats.org/drawingml/2006/main">
+                <mc:Fallback xmlns:a="http://schemas.openxmlformats.org/drawingml/2006/main" xmlns:a14="http://schemas.microsoft.com/office/drawing/2010/main" xmlns:pic="http://schemas.openxmlformats.org/drawingml/2006/picture">
                   <w:pict>
                     <v:line id="Straight Connector 112" style="position:absolute;flip:y;z-index:251742208;visibility:visible;mso-wrap-style:square;mso-width-percent:0;mso-height-percent:0;mso-wrap-distance-left:9pt;mso-wrap-distance-top:0;mso-wrap-distance-right:9pt;mso-wrap-distance-bottom:0;mso-position-horizontal:absolute;mso-position-horizontal-relative:text;mso-position-vertical:absolute;mso-position-vertical-relative:text;mso-width-percent:0;mso-height-percent:0;mso-width-relative:margin;mso-height-relative:margin" o:spid="_x0000_s1026" strokecolor="#cfcdcd [2894]" o:gfxdata="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" from="60.65pt,11.15pt" to="217.15pt,11.65pt" w14:anchorId="09107DE6">
                       <v:stroke dashstyle="dash"/>
@@ -11075,7 +12051,7 @@
                     </wp:anchor>
                   </w:drawing>
                 </mc:Choice>
-                <mc:Fallback xmlns:pic="http://schemas.openxmlformats.org/drawingml/2006/picture" xmlns:a14="http://schemas.microsoft.com/office/drawing/2010/main" xmlns:a="http://schemas.openxmlformats.org/drawingml/2006/main">
+                <mc:Fallback xmlns:a="http://schemas.openxmlformats.org/drawingml/2006/main" xmlns:a14="http://schemas.microsoft.com/office/drawing/2010/main" xmlns:pic="http://schemas.openxmlformats.org/drawingml/2006/picture">
                   <w:pict>
                     <v:line id="Straight Connector 112" style="position:absolute;z-index:251743232;visibility:visible;mso-wrap-style:square;mso-width-percent:0;mso-height-percent:0;mso-wrap-distance-left:9pt;mso-wrap-distance-top:0;mso-wrap-distance-right:9pt;mso-wrap-distance-bottom:0;mso-position-horizontal:absolute;mso-position-horizontal-relative:text;mso-position-vertical:absolute;mso-position-vertical-relative:text;mso-width-percent:0;mso-height-percent:0;mso-width-relative:margin;mso-height-relative:margin" o:spid="_x0000_s1026" strokecolor="#cfcdcd [2894]" o:gfxdata="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" from="42.15pt,12.65pt" to="232.3pt,13.1pt" w14:anchorId="758BB60E">
                       <v:stroke dashstyle="dash"/>
@@ -11323,7 +12299,7 @@
                     </wp:anchor>
                   </w:drawing>
                 </mc:Choice>
-                <mc:Fallback xmlns:pic="http://schemas.openxmlformats.org/drawingml/2006/picture" xmlns:a14="http://schemas.microsoft.com/office/drawing/2010/main" xmlns:a="http://schemas.openxmlformats.org/drawingml/2006/main">
+                <mc:Fallback xmlns:a="http://schemas.openxmlformats.org/drawingml/2006/main" xmlns:a14="http://schemas.microsoft.com/office/drawing/2010/main" xmlns:pic="http://schemas.openxmlformats.org/drawingml/2006/picture">
                   <w:pict>
                     <v:line id="Straight Connector 112" style="position:absolute;flip:y;z-index:251744256;visibility:visible;mso-wrap-style:square;mso-width-percent:0;mso-height-percent:0;mso-wrap-distance-left:9pt;mso-wrap-distance-top:0;mso-wrap-distance-right:9pt;mso-wrap-distance-bottom:0;mso-position-horizontal:absolute;mso-position-horizontal-relative:text;mso-position-vertical:absolute;mso-position-vertical-relative:text;mso-width-percent:0;mso-height-percent:0;mso-width-relative:margin;mso-height-relative:margin" o:spid="_x0000_s1026" strokecolor="#cfcdcd [2894]" o:gfxdata="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" from="-107.15pt,12.65pt" to="5.5pt,13.1pt" w14:anchorId="21F3DD14">
                       <v:stroke dashstyle="dash"/>
@@ -11460,7 +12436,7 @@
                     </wp:anchor>
                   </w:drawing>
                 </mc:Choice>
-                <mc:Fallback xmlns:pic="http://schemas.openxmlformats.org/drawingml/2006/picture" xmlns:a14="http://schemas.microsoft.com/office/drawing/2010/main" xmlns:a="http://schemas.openxmlformats.org/drawingml/2006/main">
+                <mc:Fallback xmlns:a="http://schemas.openxmlformats.org/drawingml/2006/main" xmlns:a14="http://schemas.microsoft.com/office/drawing/2010/main" xmlns:pic="http://schemas.openxmlformats.org/drawingml/2006/picture">
                   <w:pict>
                     <v:line id="Straight Connector 112" style="position:absolute;flip:y;z-index:251745280;visibility:visible;mso-wrap-style:square;mso-width-percent:0;mso-height-percent:0;mso-wrap-distance-left:9pt;mso-wrap-distance-top:0;mso-wrap-distance-right:9pt;mso-wrap-distance-bottom:0;mso-position-horizontal:absolute;mso-position-horizontal-relative:text;mso-position-vertical:absolute;mso-position-vertical-relative:text;mso-width-percent:0;mso-height-percent:0;mso-width-relative:margin;mso-height-relative:margin" o:spid="_x0000_s1026" strokecolor="#cfcdcd [2894]" o:gfxdata="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" from="88.75pt,13.05pt" to="477.7pt,13.05pt" w14:anchorId="547F408D">
                       <v:stroke dashstyle="dash"/>
@@ -11715,7 +12691,7 @@
                     </wp:anchor>
                   </w:drawing>
                 </mc:Choice>
-                <mc:Fallback xmlns:pic="http://schemas.openxmlformats.org/drawingml/2006/picture" xmlns:a14="http://schemas.microsoft.com/office/drawing/2010/main" xmlns:a="http://schemas.openxmlformats.org/drawingml/2006/main">
+                <mc:Fallback xmlns:a="http://schemas.openxmlformats.org/drawingml/2006/main" xmlns:a14="http://schemas.microsoft.com/office/drawing/2010/main" xmlns:pic="http://schemas.openxmlformats.org/drawingml/2006/picture">
                   <w:pict>
                     <v:line id="Straight Connector 112" style="position:absolute;flip:y;z-index:251746304;visibility:visible;mso-wrap-style:square;mso-width-percent:0;mso-height-percent:0;mso-wrap-distance-left:9pt;mso-wrap-distance-top:0;mso-wrap-distance-right:9pt;mso-wrap-distance-bottom:0;mso-position-horizontal:absolute;mso-position-horizontal-relative:text;mso-position-vertical:absolute;mso-position-vertical-relative:text;mso-width-percent:0;mso-height-percent:0;mso-width-relative:margin;mso-height-relative:margin" o:spid="_x0000_s1026" strokecolor="#cfcdcd [2894]" o:gfxdata="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" from="64.2pt,13.5pt" to="484.7pt,13.5pt" w14:anchorId="6A14CB8C">
                       <v:stroke dashstyle="dash"/>
@@ -12255,6 +13231,72 @@
         <w:t xml:space="preserve">   </w:t>
       </w:r>
       <w:bookmarkEnd w:id="2"/>
+    </w:p>
+    <w:p>
+      <w:pPr>
+        <w:tabs>
+          <w:tab w:val="left" w:pos="8850"/>
+        </w:tabs>
+        <w:rPr>
+          <w:rFonts w:ascii="Arial"/>
+          <w:sz w:val="20"/>
+        </w:rPr>
+      </w:pPr>
+    </w:p>
+    <w:p>
+      <w:pPr>
+        <w:tabs>
+          <w:tab w:val="left" w:pos="8850"/>
+        </w:tabs>
+        <w:rPr>
+          <w:rFonts w:ascii="Arial"/>
+          <w:sz w:val="20"/>
+        </w:rPr>
+      </w:pPr>
+    </w:p>
+    <w:p>
+      <w:pPr>
+        <w:tabs>
+          <w:tab w:val="left" w:pos="8850"/>
+        </w:tabs>
+        <w:rPr>
+          <w:rFonts w:ascii="Arial"/>
+          <w:sz w:val="20"/>
+        </w:rPr>
+      </w:pPr>
+    </w:p>
+    <w:p>
+      <w:pPr>
+        <w:tabs>
+          <w:tab w:val="left" w:pos="8850"/>
+        </w:tabs>
+        <w:rPr>
+          <w:rFonts w:ascii="Arial"/>
+          <w:sz w:val="20"/>
+        </w:rPr>
+      </w:pPr>
+    </w:p>
+    <w:p>
+      <w:pPr>
+        <w:tabs>
+          <w:tab w:val="left" w:pos="8850"/>
+        </w:tabs>
+        <w:rPr>
+          <w:rFonts w:ascii="Arial"/>
+          <w:sz w:val="20"/>
+        </w:rPr>
+      </w:pPr>
+    </w:p>
+    <w:p>
+      <w:pPr>
+        <w:tabs>
+          <w:tab w:val="left" w:pos="8850"/>
+        </w:tabs>
+        <w:rPr>
+          <w:rFonts w:ascii="Arial"/>
+          <w:sz w:val="20"/>
+        </w:rPr>
+      </w:pPr>
       <w:r>
         <w:rPr>
           <w:rFonts w:ascii="Arial"/>
@@ -12268,6 +13310,46 @@
         <w:tabs>
           <w:tab w:val="left" w:pos="8850"/>
         </w:tabs>
+        <w:rPr>
+          <w:rFonts w:ascii="Arial"/>
+          <w:sz w:val="20"/>
+        </w:rPr>
+      </w:pPr>
+    </w:p>
+    <w:p>
+      <w:pPr>
+        <w:rPr>
+          <w:rFonts w:ascii="Arial"/>
+          <w:sz w:val="20"/>
+        </w:rPr>
+      </w:pPr>
+    </w:p>
+    <w:p>
+      <w:pPr>
+        <w:rPr>
+          <w:rFonts w:ascii="Arial"/>
+          <w:sz w:val="20"/>
+        </w:rPr>
+      </w:pPr>
+    </w:p>
+    <w:p>
+      <w:pPr>
+        <w:rPr>
+          <w:rFonts w:ascii="Arial"/>
+          <w:sz w:val="20"/>
+        </w:rPr>
+      </w:pPr>
+    </w:p>
+    <w:p>
+      <w:pPr>
+        <w:rPr>
+          <w:rFonts w:ascii="Arial"/>
+          <w:sz w:val="20"/>
+        </w:rPr>
+      </w:pPr>
+    </w:p>
+    <w:p>
+      <w:pPr>
         <w:rPr>
           <w:rFonts w:ascii="Arial"/>
           <w:sz w:val="20"/>
@@ -12340,10 +13422,14 @@
         <w:tc>
           <w:tcPr>
             <w:tcW w:w="5240" w:type="dxa"/>
+            <w:tcBorders>
+              <w:right w:val="nil"/>
+            </w:tcBorders>
             <w:shd w:val="clear" w:color="auto" w:fill="002060"/>
           </w:tcPr>
           <w:p>
             <w:r>
+              <w:lastRenderedPageBreak/>
               <w:t>Contact</w:t>
             </w:r>
             <w:r>
@@ -12355,6 +13441,9 @@
           <w:tcPr>
             <w:tcW w:w="5462" w:type="dxa"/>
             <w:gridSpan w:val="5"/>
+            <w:tcBorders>
+              <w:left w:val="nil"/>
+            </w:tcBorders>
             <w:shd w:val="clear" w:color="auto" w:fill="002060"/>
           </w:tcPr>
           <w:p>
@@ -12484,7 +13573,7 @@
                     </wp:anchor>
                   </w:drawing>
                 </mc:Choice>
-                <mc:Fallback xmlns:pic="http://schemas.openxmlformats.org/drawingml/2006/picture" xmlns:a14="http://schemas.microsoft.com/office/drawing/2010/main" xmlns:a="http://schemas.openxmlformats.org/drawingml/2006/main">
+                <mc:Fallback xmlns:a="http://schemas.openxmlformats.org/drawingml/2006/main" xmlns:a14="http://schemas.microsoft.com/office/drawing/2010/main" xmlns:pic="http://schemas.openxmlformats.org/drawingml/2006/picture">
                   <w:pict>
                     <v:line id="Straight Connector 112" style="position:absolute;z-index:251731968;visibility:visible;mso-wrap-style:square;mso-width-percent:0;mso-height-percent:0;mso-wrap-distance-left:9pt;mso-wrap-distance-top:0;mso-wrap-distance-right:9pt;mso-wrap-distance-bottom:0;mso-position-horizontal:absolute;mso-position-horizontal-relative:text;mso-position-vertical:absolute;mso-position-vertical-relative:text;mso-width-percent:0;mso-height-percent:0;mso-width-relative:margin;mso-height-relative:margin" o:spid="_x0000_s1026" strokecolor="#cfcdcd [2894]" o:gfxdata="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" from="77.95pt,13.4pt" to="488.25pt,13.4pt" w14:anchorId="4AE2D5AF">
                       <v:stroke dashstyle="dash"/>
@@ -12721,7 +13810,7 @@
                     </wp:anchor>
                   </w:drawing>
                 </mc:Choice>
-                <mc:Fallback xmlns:pic="http://schemas.openxmlformats.org/drawingml/2006/picture" xmlns:a14="http://schemas.microsoft.com/office/drawing/2010/main" xmlns:a="http://schemas.openxmlformats.org/drawingml/2006/main">
+                <mc:Fallback xmlns:a="http://schemas.openxmlformats.org/drawingml/2006/main" xmlns:a14="http://schemas.microsoft.com/office/drawing/2010/main" xmlns:pic="http://schemas.openxmlformats.org/drawingml/2006/picture">
                   <w:pict>
                     <v:line id="Straight Connector 112" style="position:absolute;z-index:251732992;visibility:visible;mso-wrap-style:square;mso-width-percent:0;mso-height-percent:0;mso-wrap-distance-left:9pt;mso-wrap-distance-top:0;mso-wrap-distance-right:9pt;mso-wrap-distance-bottom:0;mso-position-horizontal:absolute;mso-position-horizontal-relative:text;mso-position-vertical:absolute;mso-position-vertical-relative:text;mso-width-percent:0;mso-height-percent:0;mso-width-relative:margin;mso-height-relative:margin" o:spid="_x0000_s1026" strokecolor="#cfcdcd [2894]" o:gfxdata="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" from="73.8pt,13.25pt" to="489.2pt,13.25pt" w14:anchorId="24F9418B">
                       <v:stroke dashstyle="dash"/>
@@ -12915,7 +14004,7 @@
                     </wp:anchor>
                   </w:drawing>
                 </mc:Choice>
-                <mc:Fallback xmlns:pic="http://schemas.openxmlformats.org/drawingml/2006/picture" xmlns:a14="http://schemas.microsoft.com/office/drawing/2010/main" xmlns:a="http://schemas.openxmlformats.org/drawingml/2006/main">
+                <mc:Fallback xmlns:a="http://schemas.openxmlformats.org/drawingml/2006/main" xmlns:a14="http://schemas.microsoft.com/office/drawing/2010/main" xmlns:pic="http://schemas.openxmlformats.org/drawingml/2006/picture">
                   <w:pict>
                     <v:line id="Straight Connector 112" style="position:absolute;z-index:251734016;visibility:visible;mso-wrap-style:square;mso-width-percent:0;mso-height-percent:0;mso-wrap-distance-left:9pt;mso-wrap-distance-top:0;mso-wrap-distance-right:9pt;mso-wrap-distance-bottom:0;mso-position-horizontal:absolute;mso-position-horizontal-relative:text;mso-position-vertical:absolute;mso-position-vertical-relative:text;mso-width-percent:0;mso-height-percent:0;mso-width-relative:margin;mso-height-relative:margin" o:spid="_x0000_s1026" strokecolor="#cfcdcd [2894]" o:gfxdata="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" from="59pt,14pt" to="470.25pt,14.45pt" w14:anchorId="1CA785F9">
                       <v:stroke dashstyle="dash"/>
@@ -13110,7 +14199,7 @@
                     </wp:anchor>
                   </w:drawing>
                 </mc:Choice>
-                <mc:Fallback xmlns:pic="http://schemas.openxmlformats.org/drawingml/2006/picture" xmlns:a14="http://schemas.microsoft.com/office/drawing/2010/main" xmlns:a="http://schemas.openxmlformats.org/drawingml/2006/main">
+                <mc:Fallback xmlns:a="http://schemas.openxmlformats.org/drawingml/2006/main" xmlns:a14="http://schemas.microsoft.com/office/drawing/2010/main" xmlns:pic="http://schemas.openxmlformats.org/drawingml/2006/picture">
                   <w:pict>
                     <v:line id="Straight Connector 112" style="position:absolute;z-index:251735040;visibility:visible;mso-wrap-style:square;mso-width-percent:0;mso-height-percent:0;mso-wrap-distance-left:9pt;mso-wrap-distance-top:0;mso-wrap-distance-right:9pt;mso-wrap-distance-bottom:0;mso-position-horizontal:absolute;mso-position-horizontal-relative:text;mso-position-vertical:absolute;mso-position-vertical-relative:text;mso-width-percent:0;mso-height-percent:0;mso-width-relative:margin;mso-height-relative:margin" o:spid="_x0000_s1026" strokecolor="#cfcdcd [2894]" o:gfxdata="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" from="119.95pt,13.85pt" to="457.75pt,14.75pt" w14:anchorId="6C723C8E">
                       <v:stroke dashstyle="dash"/>
@@ -13324,7 +14413,7 @@
                     </wp:anchor>
                   </w:drawing>
                 </mc:Choice>
-                <mc:Fallback xmlns:pic="http://schemas.openxmlformats.org/drawingml/2006/picture" xmlns:a14="http://schemas.microsoft.com/office/drawing/2010/main" xmlns:a="http://schemas.openxmlformats.org/drawingml/2006/main">
+                <mc:Fallback xmlns:a="http://schemas.openxmlformats.org/drawingml/2006/main" xmlns:a14="http://schemas.microsoft.com/office/drawing/2010/main" xmlns:pic="http://schemas.openxmlformats.org/drawingml/2006/picture">
                   <w:pict>
                     <v:line id="Straight Connector 112" style="position:absolute;z-index:251736064;visibility:visible;mso-wrap-style:square;mso-width-percent:0;mso-height-percent:0;mso-wrap-distance-left:9pt;mso-wrap-distance-top:0;mso-wrap-distance-right:9pt;mso-wrap-distance-bottom:0;mso-position-horizontal:absolute;mso-position-horizontal-relative:text;mso-position-vertical:absolute;mso-position-vertical-relative:text;mso-width-percent:0;mso-height-percent:0;mso-width-relative:margin;mso-height-relative:margin" o:spid="_x0000_s1026" strokecolor="#cfcdcd [2894]" o:gfxdata="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" from="85.8pt,13.7pt" to="462.4pt,14.15pt" w14:anchorId="178CA45B">
                       <v:stroke dashstyle="dash"/>
@@ -22723,7 +23812,7 @@
               </wp:anchor>
             </w:drawing>
           </mc:Choice>
-          <mc:Fallback xmlns:a="http://schemas.openxmlformats.org/drawingml/2006/main" xmlns:a14="http://schemas.microsoft.com/office/drawing/2010/main" xmlns:pic="http://schemas.openxmlformats.org/drawingml/2006/picture">
+          <mc:Fallback xmlns:pic="http://schemas.openxmlformats.org/drawingml/2006/picture" xmlns:a14="http://schemas.microsoft.com/office/drawing/2010/main" xmlns:a="http://schemas.openxmlformats.org/drawingml/2006/main">
             <w:pict>
               <v:rect id="Rectangle 75" style="position:absolute;margin-left:266.5pt;margin-top:804.05pt;width:1pt;height:.2pt;z-index:-251654144;visibility:visible;mso-wrap-style:square;mso-width-percent:0;mso-height-percent:0;mso-wrap-distance-left:9pt;mso-wrap-distance-top:0;mso-wrap-distance-right:9pt;mso-wrap-distance-bottom:0;mso-position-horizontal:absolute;mso-position-horizontal-relative:page;mso-position-vertical:absolute;mso-position-vertical-relative:page;mso-width-percent:0;mso-height-percent:0;mso-width-relative:page;mso-height-relative:page;v-text-anchor:top" o:spid="_x0000_s1026" fillcolor="#9d9d9d" stroked="f" o:gfxdata="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" w14:anchorId="46C3A97C">
                 <w10:wrap anchorx="page" anchory="page"/>
@@ -22803,7 +23892,7 @@
               </wp:anchor>
             </w:drawing>
           </mc:Choice>
-          <mc:Fallback xmlns:a="http://schemas.openxmlformats.org/drawingml/2006/main" xmlns:a14="http://schemas.microsoft.com/office/drawing/2010/main" xmlns:pic="http://schemas.openxmlformats.org/drawingml/2006/picture">
+          <mc:Fallback xmlns:pic="http://schemas.openxmlformats.org/drawingml/2006/picture" xmlns:a14="http://schemas.microsoft.com/office/drawing/2010/main" xmlns:a="http://schemas.openxmlformats.org/drawingml/2006/main">
             <w:pict>
               <v:rect id="Rectangle 74" style="position:absolute;margin-left:198.5pt;margin-top:804.05pt;width:2pt;height:.2pt;z-index:-251653120;visibility:visible;mso-wrap-style:square;mso-width-percent:0;mso-height-percent:0;mso-wrap-distance-left:9pt;mso-wrap-distance-top:0;mso-wrap-distance-right:9pt;mso-wrap-distance-bottom:0;mso-position-horizontal:absolute;mso-position-horizontal-relative:page;mso-position-vertical:absolute;mso-position-vertical-relative:page;mso-width-percent:0;mso-height-percent:0;mso-width-relative:page;mso-height-relative:page;v-text-anchor:top" o:spid="_x0000_s1026" fillcolor="#9d9d9d" stroked="f" o:gfxdata="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" w14:anchorId="0F2E15EB">
                 <w10:wrap anchorx="page" anchory="page"/>
@@ -22883,7 +23972,7 @@
               </wp:anchor>
             </w:drawing>
           </mc:Choice>
-          <mc:Fallback xmlns:a="http://schemas.openxmlformats.org/drawingml/2006/main" xmlns:a14="http://schemas.microsoft.com/office/drawing/2010/main" xmlns:pic="http://schemas.openxmlformats.org/drawingml/2006/picture">
+          <mc:Fallback xmlns:pic="http://schemas.openxmlformats.org/drawingml/2006/picture" xmlns:a14="http://schemas.microsoft.com/office/drawing/2010/main" xmlns:a="http://schemas.openxmlformats.org/drawingml/2006/main">
             <w:pict>
               <v:rect id="Rectangle 73" style="position:absolute;margin-left:539.5pt;margin-top:804.05pt;width:1pt;height:.2pt;z-index:-251652096;visibility:visible;mso-wrap-style:square;mso-width-percent:0;mso-height-percent:0;mso-wrap-distance-left:9pt;mso-wrap-distance-top:0;mso-wrap-distance-right:9pt;mso-wrap-distance-bottom:0;mso-position-horizontal:absolute;mso-position-horizontal-relative:page;mso-position-vertical:absolute;mso-position-vertical-relative:page;mso-width-percent:0;mso-height-percent:0;mso-width-relative:page;mso-height-relative:page;v-text-anchor:top" o:spid="_x0000_s1026" fillcolor="#9d9d9d" stroked="f" o:gfxdata="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" w14:anchorId="5650B171">
                 <w10:wrap anchorx="page" anchory="page"/>
@@ -22963,7 +24052,7 @@
               </wp:anchor>
             </w:drawing>
           </mc:Choice>
-          <mc:Fallback xmlns:a="http://schemas.openxmlformats.org/drawingml/2006/main" xmlns:a14="http://schemas.microsoft.com/office/drawing/2010/main" xmlns:pic="http://schemas.openxmlformats.org/drawingml/2006/picture">
+          <mc:Fallback xmlns:pic="http://schemas.openxmlformats.org/drawingml/2006/picture" xmlns:a14="http://schemas.microsoft.com/office/drawing/2010/main" xmlns:a="http://schemas.openxmlformats.org/drawingml/2006/main">
             <w:pict>
               <v:rect id="Rectangle 72" style="position:absolute;margin-left:471.5pt;margin-top:804.05pt;width:2pt;height:.2pt;z-index:-251651072;visibility:visible;mso-wrap-style:square;mso-width-percent:0;mso-height-percent:0;mso-wrap-distance-left:9pt;mso-wrap-distance-top:0;mso-wrap-distance-right:9pt;mso-wrap-distance-bottom:0;mso-position-horizontal:absolute;mso-position-horizontal-relative:page;mso-position-vertical:absolute;mso-position-vertical-relative:page;mso-width-percent:0;mso-height-percent:0;mso-width-relative:page;mso-height-relative:page;v-text-anchor:top" o:spid="_x0000_s1026" fillcolor="#9d9d9d" stroked="f" o:gfxdata="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" w14:anchorId="7751343D">
                 <w10:wrap anchorx="page" anchory="page"/>
@@ -25908,7 +26997,7 @@
                           </pic:cNvPicPr>
                         </pic:nvPicPr>
                         <pic:blipFill>
-                          <a:blip r:embed="rId27">
+                          <a:blip r:embed="rId22">
                             <a:extLst>
                               <a:ext uri="{28A0092B-C50C-407E-A947-70E740481C1C}">
                                 <a14:useLocalDpi xmlns:a14="http://schemas.microsoft.com/office/drawing/2010/main" val="0"/>
@@ -26910,7 +27999,7 @@
             <w:pict>
               <v:group w14:anchorId="1D166B05" id="Group 49" o:spid="_x0000_s1073" style="position:absolute;margin-left:27.65pt;margin-top:167.2pt;width:539pt;height:68pt;z-index:-251644928;mso-wrap-distance-left:0;mso-wrap-distance-right:0;mso-position-horizontal-relative:page;mso-position-vertical-relative:text" coordorigin="560,250" coordsize="10780,1360" o:gfxdata="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">
                 <v:shape id="Picture 130" o:spid="_x0000_s1074" type="#_x0000_t75" style="position:absolute;left:4346;top:1298;width:334;height:150;visibility:visible;mso-wrap-style:square" o:gfxdata="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">
-                  <v:imagedata r:id="rId28" o:title=""/>
+                  <v:imagedata r:id="rId23" o:title=""/>
                 </v:shape>
                 <v:rect id="Rectangle 131" o:spid="_x0000_s1075" style="position:absolute;left:563;top:253;width:10774;height:1354;visibility:visible;mso-wrap-style:square;v-text-anchor:top" o:gfxdata="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" filled="f" strokecolor="#e1e1e1" strokeweight=".3pt"/>
                 <v:rect id="Rectangle 132" o:spid="_x0000_s1076" style="position:absolute;left:560;top:250;width:10780;height:432;visibility:visible;mso-wrap-style:square;v-text-anchor:top" o:gfxdata="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" fillcolor="#252b4f" stroked="f"/>
@@ -28961,7 +30050,7 @@
                           </pic:cNvPicPr>
                         </pic:nvPicPr>
                         <pic:blipFill>
-                          <a:blip r:embed="rId29">
+                          <a:blip r:embed="rId24">
                             <a:extLst>
                               <a:ext uri="{28A0092B-C50C-407E-A947-70E740481C1C}">
                                 <a14:useLocalDpi xmlns:a14="http://schemas.microsoft.com/office/drawing/2010/main" val="0"/>
@@ -29014,7 +30103,7 @@
                           </pic:cNvPicPr>
                         </pic:nvPicPr>
                         <pic:blipFill>
-                          <a:blip r:embed="rId30">
+                          <a:blip r:embed="rId25">
                             <a:extLst>
                               <a:ext uri="{28A0092B-C50C-407E-A947-70E740481C1C}">
                                 <a14:useLocalDpi xmlns:a14="http://schemas.microsoft.com/office/drawing/2010/main" val="0"/>
@@ -29067,7 +30156,7 @@
                           </pic:cNvPicPr>
                         </pic:nvPicPr>
                         <pic:blipFill>
-                          <a:blip r:embed="rId31">
+                          <a:blip r:embed="rId26">
                             <a:extLst>
                               <a:ext uri="{28A0092B-C50C-407E-A947-70E740481C1C}">
                                 <a14:useLocalDpi xmlns:a14="http://schemas.microsoft.com/office/drawing/2010/main" val="0"/>
@@ -29124,7 +30213,7 @@
               </wp:anchor>
             </w:drawing>
           </mc:Choice>
-          <mc:Fallback xmlns:a="http://schemas.openxmlformats.org/drawingml/2006/main" xmlns:a14="http://schemas.microsoft.com/office/drawing/2010/main" xmlns:pic="http://schemas.openxmlformats.org/drawingml/2006/picture">
+          <mc:Fallback xmlns:pic="http://schemas.openxmlformats.org/drawingml/2006/picture" xmlns:a14="http://schemas.microsoft.com/office/drawing/2010/main" xmlns:a="http://schemas.openxmlformats.org/drawingml/2006/main">
             <w:pict>
               <v:group id="Group 38" style="position:absolute;margin-left:180.75pt;margin-top:95.15pt;width:233.75pt;height:73.8pt;z-index:-251650048;mso-position-horizontal-relative:page" coordsize="4675,1476" coordorigin="3615,1903" o:spid="_x0000_s1026" o:gfxdata="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" w14:anchorId="07FB9762">
                 <v:shape id="AutoShape 107" style="position:absolute;left:3615;top:1902;width:4675;height:1476;visibility:visible;mso-wrap-style:square;v-text-anchor:top" coordsize="4675,1476" o:spid="_x0000_s1027" fillcolor="#f5f5f4" stroked="f" path="m1056,1409r-353,l703,1254r314,l1017,1195r-314,l703,1059r333,l1036,1000r-335,l642,1002r-42,11l575,1031r-9,26l567,1409r4,25l594,1454r44,12l703,1469r353,l1056,1409xm1646,1000r-136,l1510,1313r,13l1508,1339r-3,12l1500,1362r-5,10l1488,1380r-8,8l1471,1394r-10,5l1451,1404r-12,3l1426,1410r-14,2l1397,1414r-16,1l1365,1415r-14,l1339,1414r-12,l1300,1411r-13,-1l1276,1407r-17,59l1269,1468r11,2l1293,1471r10,1l1313,1473r10,1l1334,1474r22,1l1366,1475r11,l1406,1475r27,-2l1460,1471r25,-4l1509,1463r22,-6l1551,1449r19,-9l1587,1430r15,-11l1606,1415r9,-10l1626,1391r9,-17l1641,1356r4,-21l1646,1313r,-313xm2632,1469l2386,1048r,228l2271,1276r-116,l2227,1153r5,-10l2236,1133r5,-10l2246,1112r5,-10l2255,1091r5,-10l2264,1071r5,-10l2271,1061r5,11l2281,1083r11,24l2298,1119r6,11l2310,1142r6,12l2386,1276r,-228l2358,1000r-87,l2191,1000r-274,469l2056,1469r78,-138l2271,1331r137,l2489,1469r143,xm3467,854l3296,842r-49,-3l2338,816r-763,3l1077,834,625,877,,961,184,943,685,902r743,-41l2338,842r762,2l3467,854xm3490,1469r-5,-6l3478,1453r-7,-12l3466,1432r-5,-11l3455,1410r-6,-13l3443,1384r-6,-13l3430,1357r-6,-16l3415,1323r-10,-16l3392,1293r-14,-13l3362,1269r-19,-10l3322,1252r-24,-6l3298,1245r22,-5l3341,1234r20,-7l3380,1219r17,-8l3412,1201r14,-10l3437,1179r10,-12l3453,1154r4,-14l3459,1126r-1,-14l3454,1099r-5,-13l3441,1074r-11,-12l3418,1052r-14,-9l3387,1034r-22,-9l3340,1017r-17,-4l3323,1133r-2,12l3317,1157r-7,10l3300,1177r-12,9l3274,1194r-17,7l3237,1206r-12,3l3213,1212r-14,1l3186,1215r-11,1l3163,1217r-11,l3140,1217r-92,l3048,1056r9,-1l3069,1054r29,-1l3112,1052r15,l3143,1052r11,l3165,1052r10,1l3186,1053r9,1l3204,1055r9,1l3228,1059r15,3l3257,1065r13,5l3281,1075r11,6l3301,1088r8,7l3315,1103r4,9l3322,1122r1,11l3323,1013r-10,-2l3282,1006r-22,-3l3237,1001r-25,-2l3186,998r-13,-1l3159,997r-27,l3091,997r-58,2l2995,1001r-35,2l2928,1005r-14,2l2914,1469r134,l3048,1270r82,l3145,1271r15,l3173,1272r13,2l3194,1275r8,2l3209,1279r16,5l3238,1290r13,8l3261,1307r10,10l3279,1329r8,13l3293,1356r6,15l3304,1384r6,12l3315,1408r5,11l3325,1429r5,9l3334,1446r6,11l3345,1464r5,5l3490,1469xm3904,1000r-136,l3768,1469r136,l3904,1000xm3910,l3772,r,463l3910,463,3910,xm4262,916l4050,892,3598,857r-131,-3l3990,889r272,27xm4675,961l4491,939,4262,916r413,45xe" o:gfxdata="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">
@@ -29538,7 +30627,7 @@
               </wp:anchor>
             </w:drawing>
           </mc:Choice>
-          <mc:Fallback xmlns:a="http://schemas.openxmlformats.org/drawingml/2006/main" xmlns:a14="http://schemas.microsoft.com/office/drawing/2010/main" xmlns:pic="http://schemas.openxmlformats.org/drawingml/2006/picture">
+          <mc:Fallback xmlns:pic="http://schemas.openxmlformats.org/drawingml/2006/picture" xmlns:a14="http://schemas.microsoft.com/office/drawing/2010/main" xmlns:a="http://schemas.openxmlformats.org/drawingml/2006/main">
             <w:pict>
               <v:shape id="Freeform 37" style="position:absolute;margin-left:280.6pt;margin-top:94.65pt;width:76.55pt;height:23.95pt;z-index:-251649024;visibility:visible;mso-wrap-style:square;mso-width-percent:0;mso-height-percent:0;mso-wrap-distance-left:9pt;mso-wrap-distance-top:0;mso-wrap-distance-right:9pt;mso-wrap-distance-bottom:0;mso-position-horizontal:absolute;mso-position-horizontal-relative:page;mso-position-vertical:absolute;mso-position-vertical-relative:text;mso-width-percent:0;mso-height-percent:0;mso-width-relative:page;mso-height-relative:page;v-text-anchor:top" coordsize="1531,479" o:spid="_x0000_s1026" fillcolor="#f5f5f4" stroked="f" path="m1399,478r-468,l862,478r-726,l75,474,32,453,7,416,,363,,,138,r,399l834,399r,-175l510,224r,-79l834,145r69,9l946,177r22,36l972,258r,141l1393,399r,-254l1531,145r,221l1524,414r-23,36l1460,472r-61,6xe" o:gfxdata="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" w14:anchorId="471C21BF">
                 <v:path arrowok="t" o:connecttype="custom" o:connectlocs="888365,1505585;591185,1505585;591185,1505585;547370,1505585;547370,1505585;86360,1505585;47625,1503045;20320,1489710;4445,1466215;0,1432560;0,1202055;87630,1202055;87630,1455420;529590,1455420;529590,1344295;323850,1344295;323850,1294130;529590,1294130;573405,1299845;600710,1314450;614680,1337310;617220,1365885;617220,1455420;884555,1455420;884555,1294130;972185,1294130;972185,1434465;967740,1464945;953135,1487805;927100,1501775;888365,1505585;888365,1505585" o:connectangles="0,0,0,0,0,0,0,0,0,0,0,0,0,0,0,0,0,0,0,0,0,0,0,0,0,0,0,0,0,0,0,0"/>
@@ -29880,7 +30969,7 @@
               </wp:anchor>
             </w:drawing>
           </mc:Choice>
-          <mc:Fallback xmlns:a="http://schemas.openxmlformats.org/drawingml/2006/main" xmlns:a14="http://schemas.microsoft.com/office/drawing/2010/main" xmlns:pic="http://schemas.openxmlformats.org/drawingml/2006/picture">
+          <mc:Fallback xmlns:pic="http://schemas.openxmlformats.org/drawingml/2006/picture" xmlns:a14="http://schemas.microsoft.com/office/drawing/2010/main" xmlns:a="http://schemas.openxmlformats.org/drawingml/2006/main">
             <w:pict>
               <v:shape id="Freeform 36" style="position:absolute;margin-left:206.55pt;margin-top:94.9pt;width:35.6pt;height:24.65pt;z-index:-251648000;visibility:visible;mso-wrap-style:square;mso-width-percent:0;mso-height-percent:0;mso-wrap-distance-left:9pt;mso-wrap-distance-top:0;mso-wrap-distance-right:9pt;mso-wrap-distance-bottom:0;mso-position-horizontal:absolute;mso-position-horizontal-relative:page;mso-position-vertical:absolute;mso-position-vertical-relative:text;mso-width-percent:0;mso-height-percent:0;mso-width-relative:page;mso-height-relative:page;v-text-anchor:top" coordsize="712,493" o:spid="_x0000_s1026" fillcolor="#f5f5f4" stroked="f" path="m575,492r-451,l29,467,,377,,158r125,l125,408r450,l575,304r-298,l277,113r5,-47l301,30,341,8,408,,711,r,85l402,85r,131l701,216r,161l698,426r-21,36l637,485r-62,7xe" o:gfxdata="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" w14:anchorId="22AC1D6D">
                 <v:path arrowok="t" o:connecttype="custom" o:connectlocs="365125,1517650;78740,1517650;18415,1501775;0,1444625;0,1305560;79375,1305560;79375,1464310;365125,1464310;365125,1398270;175895,1398270;175895,1276985;179070,1247140;191135,1224280;216535,1210310;259080,1205230;451485,1205230;451485,1259205;255270,1259205;255270,1342390;445135,1342390;445135,1444625;443230,1475740;429895,1498600;404495,1513205;365125,1517650" o:connectangles="0,0,0,0,0,0,0,0,0,0,0,0,0,0,0,0,0,0,0,0,0,0,0,0,0"/>
@@ -32802,36 +33891,6 @@
 </w:endnotes>
 </file>
 
-<file path=word/footer1.xml><?xml version="1.0" encoding="utf-8"?>
-<w:ftr xmlns:wpc="http://schemas.microsoft.com/office/word/2010/wordprocessingCanvas" xmlns:cx="http://schemas.microsoft.com/office/drawing/2014/chartex" xmlns:cx1="http://schemas.microsoft.com/office/drawing/2015/9/8/chartex" xmlns:cx2="http://schemas.microsoft.com/office/drawing/2015/10/21/chartex" xmlns:cx3="http://schemas.microsoft.com/office/drawing/2016/5/9/chartex" xmlns:cx4="http://schemas.microsoft.com/office/drawing/2016/5/10/chartex" xmlns:cx5="http://schemas.microsoft.com/office/drawing/2016/5/11/chartex" xmlns:cx6="http://schemas.microsoft.com/office/drawing/2016/5/12/chartex" xmlns:cx7="http://schemas.microsoft.com/office/drawing/2016/5/13/chartex" xmlns:cx8="http://schemas.microsoft.com/office/drawing/2016/5/14/chartex" xmlns:mc="http://schemas.openxmlformats.org/markup-compatibility/2006" xmlns:aink="http://schemas.microsoft.com/office/drawing/2016/ink" xmlns:am3d="http://schemas.microsoft.com/office/drawing/2017/model3d" xmlns:o="urn:schemas-microsoft-com:office:office" xmlns:oel="http://schemas.microsoft.com/office/2019/extlst" xmlns:r="http://schemas.openxmlformats.org/officeDocument/2006/relationships" xmlns:m="http://schemas.openxmlformats.org/officeDocument/2006/math" xmlns:v="urn:schemas-microsoft-com:vml" xmlns:wp14="http://schemas.microsoft.com/office/word/2010/wordprocessingDrawing" xmlns:wp="http://schemas.openxmlformats.org/drawingml/2006/wordprocessingDrawing" xmlns:w10="urn:schemas-microsoft-com:office:word" xmlns:w="http://schemas.openxmlformats.org/wordprocessingml/2006/main" xmlns:w14="http://schemas.microsoft.com/office/word/2010/wordml" xmlns:w15="http://schemas.microsoft.com/office/word/2012/wordml" xmlns:w16cex="http://schemas.microsoft.com/office/word/2018/wordml/cex" xmlns:w16cid="http://schemas.microsoft.com/office/word/2016/wordml/cid" xmlns:w16="http://schemas.microsoft.com/office/word/2018/wordml" xmlns:w16du="http://schemas.microsoft.com/office/word/2023/wordml/word16du" xmlns:w16sdtdh="http://schemas.microsoft.com/office/word/2020/wordml/sdtdatahash" xmlns:w16se="http://schemas.microsoft.com/office/word/2015/wordml/symex" xmlns:wpg="http://schemas.microsoft.com/office/word/2010/wordprocessingGroup" xmlns:wpi="http://schemas.microsoft.com/office/word/2010/wordprocessingInk" xmlns:wne="http://schemas.microsoft.com/office/word/2006/wordml" xmlns:wps="http://schemas.microsoft.com/office/word/2010/wordprocessingShape" mc:Ignorable="w14 w15 w16se w16cid w16 w16cex w16sdtdh w16du wp14">
-  <w:p>
-    <w:pPr>
-      <w:pStyle w:val="Footer"/>
-    </w:pPr>
-  </w:p>
-</w:ftr>
-</file>
-
-<file path=word/footer2.xml><?xml version="1.0" encoding="utf-8"?>
-<w:ftr xmlns:wpc="http://schemas.microsoft.com/office/word/2010/wordprocessingCanvas" xmlns:cx="http://schemas.microsoft.com/office/drawing/2014/chartex" xmlns:cx1="http://schemas.microsoft.com/office/drawing/2015/9/8/chartex" xmlns:cx2="http://schemas.microsoft.com/office/drawing/2015/10/21/chartex" xmlns:cx3="http://schemas.microsoft.com/office/drawing/2016/5/9/chartex" xmlns:cx4="http://schemas.microsoft.com/office/drawing/2016/5/10/chartex" xmlns:cx5="http://schemas.microsoft.com/office/drawing/2016/5/11/chartex" xmlns:cx6="http://schemas.microsoft.com/office/drawing/2016/5/12/chartex" xmlns:cx7="http://schemas.microsoft.com/office/drawing/2016/5/13/chartex" xmlns:cx8="http://schemas.microsoft.com/office/drawing/2016/5/14/chartex" xmlns:mc="http://schemas.openxmlformats.org/markup-compatibility/2006" xmlns:aink="http://schemas.microsoft.com/office/drawing/2016/ink" xmlns:am3d="http://schemas.microsoft.com/office/drawing/2017/model3d" xmlns:o="urn:schemas-microsoft-com:office:office" xmlns:oel="http://schemas.microsoft.com/office/2019/extlst" xmlns:r="http://schemas.openxmlformats.org/officeDocument/2006/relationships" xmlns:m="http://schemas.openxmlformats.org/officeDocument/2006/math" xmlns:v="urn:schemas-microsoft-com:vml" xmlns:wp14="http://schemas.microsoft.com/office/word/2010/wordprocessingDrawing" xmlns:wp="http://schemas.openxmlformats.org/drawingml/2006/wordprocessingDrawing" xmlns:w10="urn:schemas-microsoft-com:office:word" xmlns:w="http://schemas.openxmlformats.org/wordprocessingml/2006/main" xmlns:w14="http://schemas.microsoft.com/office/word/2010/wordml" xmlns:w15="http://schemas.microsoft.com/office/word/2012/wordml" xmlns:w16cex="http://schemas.microsoft.com/office/word/2018/wordml/cex" xmlns:w16cid="http://schemas.microsoft.com/office/word/2016/wordml/cid" xmlns:w16="http://schemas.microsoft.com/office/word/2018/wordml" xmlns:w16du="http://schemas.microsoft.com/office/word/2023/wordml/word16du" xmlns:w16sdtdh="http://schemas.microsoft.com/office/word/2020/wordml/sdtdatahash" xmlns:w16se="http://schemas.microsoft.com/office/word/2015/wordml/symex" xmlns:wpg="http://schemas.microsoft.com/office/word/2010/wordprocessingGroup" xmlns:wpi="http://schemas.microsoft.com/office/word/2010/wordprocessingInk" xmlns:wne="http://schemas.microsoft.com/office/word/2006/wordml" xmlns:wps="http://schemas.microsoft.com/office/word/2010/wordprocessingShape" mc:Ignorable="w14 w15 w16se w16cid w16 w16cex w16sdtdh w16du wp14">
-  <w:p>
-    <w:pPr>
-      <w:pStyle w:val="Footer"/>
-    </w:pPr>
-  </w:p>
-</w:ftr>
-</file>
-
-<file path=word/footer3.xml><?xml version="1.0" encoding="utf-8"?>
-<w:ftr xmlns:wpc="http://schemas.microsoft.com/office/word/2010/wordprocessingCanvas" xmlns:cx="http://schemas.microsoft.com/office/drawing/2014/chartex" xmlns:cx1="http://schemas.microsoft.com/office/drawing/2015/9/8/chartex" xmlns:cx2="http://schemas.microsoft.com/office/drawing/2015/10/21/chartex" xmlns:cx3="http://schemas.microsoft.com/office/drawing/2016/5/9/chartex" xmlns:cx4="http://schemas.microsoft.com/office/drawing/2016/5/10/chartex" xmlns:cx5="http://schemas.microsoft.com/office/drawing/2016/5/11/chartex" xmlns:cx6="http://schemas.microsoft.com/office/drawing/2016/5/12/chartex" xmlns:cx7="http://schemas.microsoft.com/office/drawing/2016/5/13/chartex" xmlns:cx8="http://schemas.microsoft.com/office/drawing/2016/5/14/chartex" xmlns:mc="http://schemas.openxmlformats.org/markup-compatibility/2006" xmlns:aink="http://schemas.microsoft.com/office/drawing/2016/ink" xmlns:am3d="http://schemas.microsoft.com/office/drawing/2017/model3d" xmlns:o="urn:schemas-microsoft-com:office:office" xmlns:oel="http://schemas.microsoft.com/office/2019/extlst" xmlns:r="http://schemas.openxmlformats.org/officeDocument/2006/relationships" xmlns:m="http://schemas.openxmlformats.org/officeDocument/2006/math" xmlns:v="urn:schemas-microsoft-com:vml" xmlns:wp14="http://schemas.microsoft.com/office/word/2010/wordprocessingDrawing" xmlns:wp="http://schemas.openxmlformats.org/drawingml/2006/wordprocessingDrawing" xmlns:w10="urn:schemas-microsoft-com:office:word" xmlns:w="http://schemas.openxmlformats.org/wordprocessingml/2006/main" xmlns:w14="http://schemas.microsoft.com/office/word/2010/wordml" xmlns:w15="http://schemas.microsoft.com/office/word/2012/wordml" xmlns:w16cex="http://schemas.microsoft.com/office/word/2018/wordml/cex" xmlns:w16cid="http://schemas.microsoft.com/office/word/2016/wordml/cid" xmlns:w16="http://schemas.microsoft.com/office/word/2018/wordml" xmlns:w16du="http://schemas.microsoft.com/office/word/2023/wordml/word16du" xmlns:w16sdtdh="http://schemas.microsoft.com/office/word/2020/wordml/sdtdatahash" xmlns:w16se="http://schemas.microsoft.com/office/word/2015/wordml/symex" xmlns:wpg="http://schemas.microsoft.com/office/word/2010/wordprocessingGroup" xmlns:wpi="http://schemas.microsoft.com/office/word/2010/wordprocessingInk" xmlns:wne="http://schemas.microsoft.com/office/word/2006/wordml" xmlns:wps="http://schemas.microsoft.com/office/word/2010/wordprocessingShape" mc:Ignorable="w14 w15 w16se w16cid w16 w16cex w16sdtdh w16du wp14">
-  <w:p>
-    <w:pPr>
-      <w:pStyle w:val="Footer"/>
-    </w:pPr>
-  </w:p>
-</w:ftr>
-</file>
-
 <file path=word/footnotes.xml><?xml version="1.0" encoding="utf-8"?>
 <w:footnotes xmlns:wpc="http://schemas.microsoft.com/office/word/2010/wordprocessingCanvas" xmlns:cx="http://schemas.microsoft.com/office/drawing/2014/chartex" xmlns:cx1="http://schemas.microsoft.com/office/drawing/2015/9/8/chartex" xmlns:cx2="http://schemas.microsoft.com/office/drawing/2015/10/21/chartex" xmlns:cx3="http://schemas.microsoft.com/office/drawing/2016/5/9/chartex" xmlns:cx4="http://schemas.microsoft.com/office/drawing/2016/5/10/chartex" xmlns:cx5="http://schemas.microsoft.com/office/drawing/2016/5/11/chartex" xmlns:cx6="http://schemas.microsoft.com/office/drawing/2016/5/12/chartex" xmlns:cx7="http://schemas.microsoft.com/office/drawing/2016/5/13/chartex" xmlns:cx8="http://schemas.microsoft.com/office/drawing/2016/5/14/chartex" xmlns:mc="http://schemas.openxmlformats.org/markup-compatibility/2006" xmlns:aink="http://schemas.microsoft.com/office/drawing/2016/ink" xmlns:am3d="http://schemas.microsoft.com/office/drawing/2017/model3d" xmlns:o="urn:schemas-microsoft-com:office:office" xmlns:oel="http://schemas.microsoft.com/office/2019/extlst" xmlns:r="http://schemas.openxmlformats.org/officeDocument/2006/relationships" xmlns:m="http://schemas.openxmlformats.org/officeDocument/2006/math" xmlns:v="urn:schemas-microsoft-com:vml" xmlns:wp14="http://schemas.microsoft.com/office/word/2010/wordprocessingDrawing" xmlns:wp="http://schemas.openxmlformats.org/drawingml/2006/wordprocessingDrawing" xmlns:w10="urn:schemas-microsoft-com:office:word" xmlns:w="http://schemas.openxmlformats.org/wordprocessingml/2006/main" xmlns:w14="http://schemas.microsoft.com/office/word/2010/wordml" xmlns:w15="http://schemas.microsoft.com/office/word/2012/wordml" xmlns:w16cex="http://schemas.microsoft.com/office/word/2018/wordml/cex" xmlns:w16cid="http://schemas.microsoft.com/office/word/2016/wordml/cid" xmlns:w16="http://schemas.microsoft.com/office/word/2018/wordml" xmlns:w16du="http://schemas.microsoft.com/office/word/2023/wordml/word16du" xmlns:w16sdtdh="http://schemas.microsoft.com/office/word/2020/wordml/sdtdatahash" xmlns:w16se="http://schemas.microsoft.com/office/word/2015/wordml/symex" xmlns:wpg="http://schemas.microsoft.com/office/word/2010/wordprocessingGroup" xmlns:wpi="http://schemas.microsoft.com/office/word/2010/wordprocessingInk" xmlns:wne="http://schemas.microsoft.com/office/word/2006/wordml" xmlns:wps="http://schemas.microsoft.com/office/word/2010/wordprocessingShape" mc:Ignorable="w14 w15 w16se w16cid w16 w16cex w16sdtdh w16du wp14">
   <w:footnote w:type="separator" w:id="-1">
@@ -32858,16 +33917,6 @@
 </file>
 
 <file path=word/header1.xml><?xml version="1.0" encoding="utf-8"?>
-<w:hdr xmlns:wpc="http://schemas.microsoft.com/office/word/2010/wordprocessingCanvas" xmlns:cx="http://schemas.microsoft.com/office/drawing/2014/chartex" xmlns:cx1="http://schemas.microsoft.com/office/drawing/2015/9/8/chartex" xmlns:cx2="http://schemas.microsoft.com/office/drawing/2015/10/21/chartex" xmlns:cx3="http://schemas.microsoft.com/office/drawing/2016/5/9/chartex" xmlns:cx4="http://schemas.microsoft.com/office/drawing/2016/5/10/chartex" xmlns:cx5="http://schemas.microsoft.com/office/drawing/2016/5/11/chartex" xmlns:cx6="http://schemas.microsoft.com/office/drawing/2016/5/12/chartex" xmlns:cx7="http://schemas.microsoft.com/office/drawing/2016/5/13/chartex" xmlns:cx8="http://schemas.microsoft.com/office/drawing/2016/5/14/chartex" xmlns:mc="http://schemas.openxmlformats.org/markup-compatibility/2006" xmlns:aink="http://schemas.microsoft.com/office/drawing/2016/ink" xmlns:am3d="http://schemas.microsoft.com/office/drawing/2017/model3d" xmlns:o="urn:schemas-microsoft-com:office:office" xmlns:oel="http://schemas.microsoft.com/office/2019/extlst" xmlns:r="http://schemas.openxmlformats.org/officeDocument/2006/relationships" xmlns:m="http://schemas.openxmlformats.org/officeDocument/2006/math" xmlns:v="urn:schemas-microsoft-com:vml" xmlns:wp14="http://schemas.microsoft.com/office/word/2010/wordprocessingDrawing" xmlns:wp="http://schemas.openxmlformats.org/drawingml/2006/wordprocessingDrawing" xmlns:w10="urn:schemas-microsoft-com:office:word" xmlns:w="http://schemas.openxmlformats.org/wordprocessingml/2006/main" xmlns:w14="http://schemas.microsoft.com/office/word/2010/wordml" xmlns:w15="http://schemas.microsoft.com/office/word/2012/wordml" xmlns:w16cex="http://schemas.microsoft.com/office/word/2018/wordml/cex" xmlns:w16cid="http://schemas.microsoft.com/office/word/2016/wordml/cid" xmlns:w16="http://schemas.microsoft.com/office/word/2018/wordml" xmlns:w16du="http://schemas.microsoft.com/office/word/2023/wordml/word16du" xmlns:w16sdtdh="http://schemas.microsoft.com/office/word/2020/wordml/sdtdatahash" xmlns:w16se="http://schemas.microsoft.com/office/word/2015/wordml/symex" xmlns:wpg="http://schemas.microsoft.com/office/word/2010/wordprocessingGroup" xmlns:wpi="http://schemas.microsoft.com/office/word/2010/wordprocessingInk" xmlns:wne="http://schemas.microsoft.com/office/word/2006/wordml" xmlns:wps="http://schemas.microsoft.com/office/word/2010/wordprocessingShape" mc:Ignorable="w14 w15 w16se w16cid w16 w16cex w16sdtdh w16du wp14">
-  <w:p>
-    <w:pPr>
-      <w:pStyle w:val="Header"/>
-    </w:pPr>
-  </w:p>
-</w:hdr>
-</file>
-
-<file path=word/header2.xml><?xml version="1.0" encoding="utf-8"?>
 <w:hdr xmlns:wpc="http://schemas.microsoft.com/office/word/2010/wordprocessingCanvas" xmlns:cx="http://schemas.microsoft.com/office/drawing/2014/chartex" xmlns:cx1="http://schemas.microsoft.com/office/drawing/2015/9/8/chartex" xmlns:cx2="http://schemas.microsoft.com/office/drawing/2015/10/21/chartex" xmlns:cx3="http://schemas.microsoft.com/office/drawing/2016/5/9/chartex" xmlns:cx4="http://schemas.microsoft.com/office/drawing/2016/5/10/chartex" xmlns:cx5="http://schemas.microsoft.com/office/drawing/2016/5/11/chartex" xmlns:cx6="http://schemas.microsoft.com/office/drawing/2016/5/12/chartex" xmlns:cx7="http://schemas.microsoft.com/office/drawing/2016/5/13/chartex" xmlns:cx8="http://schemas.microsoft.com/office/drawing/2016/5/14/chartex" xmlns:mc="http://schemas.openxmlformats.org/markup-compatibility/2006" xmlns:aink="http://schemas.microsoft.com/office/drawing/2016/ink" xmlns:am3d="http://schemas.microsoft.com/office/drawing/2017/model3d" xmlns:o="urn:schemas-microsoft-com:office:office" xmlns:oel="http://schemas.microsoft.com/office/2019/extlst" xmlns:r="http://schemas.openxmlformats.org/officeDocument/2006/relationships" xmlns:m="http://schemas.openxmlformats.org/officeDocument/2006/math" xmlns:v="urn:schemas-microsoft-com:vml" xmlns:wp14="http://schemas.microsoft.com/office/word/2010/wordprocessingDrawing" xmlns:wp="http://schemas.openxmlformats.org/drawingml/2006/wordprocessingDrawing" xmlns:w10="urn:schemas-microsoft-com:office:word" xmlns:w="http://schemas.openxmlformats.org/wordprocessingml/2006/main" xmlns:w14="http://schemas.microsoft.com/office/word/2010/wordml" xmlns:w15="http://schemas.microsoft.com/office/word/2012/wordml" xmlns:w16cex="http://schemas.microsoft.com/office/word/2018/wordml/cex" xmlns:w16cid="http://schemas.microsoft.com/office/word/2016/wordml/cid" xmlns:w16="http://schemas.microsoft.com/office/word/2018/wordml" xmlns:w16du="http://schemas.microsoft.com/office/word/2023/wordml/word16du" xmlns:w16sdtdh="http://schemas.microsoft.com/office/word/2020/wordml/sdtdatahash" xmlns:w16se="http://schemas.microsoft.com/office/word/2015/wordml/symex" xmlns:wpg="http://schemas.microsoft.com/office/word/2010/wordprocessingGroup" xmlns:wpi="http://schemas.microsoft.com/office/word/2010/wordprocessingInk" xmlns:wne="http://schemas.microsoft.com/office/word/2006/wordml" xmlns:wps="http://schemas.microsoft.com/office/word/2010/wordprocessingShape" mc:Ignorable="w14 w15 w16se w16cid w16 w16cex w16sdtdh w16du wp14">
   <w:p>
     <w:pPr>
@@ -32985,9 +34034,9 @@
                                   <w:noProof/>
                                 </w:rPr>
                                 <w:drawing>
-                                  <wp:inline distT="0" distB="0" distL="0" distR="0" wp14:anchorId="7E1130D4" wp14:editId="6DF38DD9">
-                                    <wp:extent cx="1766454" cy="788035"/>
-                                    <wp:effectExtent l="0" t="0" r="5715" b="0"/>
+                                  <wp:inline distT="0" distB="0" distL="0" distR="0" wp14:anchorId="7E1130D4" wp14:editId="162F711B">
+                                    <wp:extent cx="1730375" cy="795655"/>
+                                    <wp:effectExtent l="0" t="0" r="3175" b="4445"/>
                                     <wp:docPr id="1" name="Picture 92"/>
                                     <wp:cNvGraphicFramePr>
                                       <a:graphicFrameLocks xmlns:a="http://schemas.openxmlformats.org/drawingml/2006/main" noChangeAspect="1"/>
@@ -33010,7 +34059,7 @@
                                           <pic:spPr bwMode="auto">
                                             <a:xfrm>
                                               <a:off x="0" y="0"/>
-                                              <a:ext cx="1784364" cy="796025"/>
+                                              <a:ext cx="1731184" cy="796027"/>
                                             </a:xfrm>
                                             <a:prstGeom prst="rect">
                                               <a:avLst/>
@@ -33073,9 +34122,9 @@
                             <w:noProof/>
                           </w:rPr>
                           <w:drawing>
-                            <wp:inline distT="0" distB="0" distL="0" distR="0" wp14:anchorId="7E1130D4" wp14:editId="6DF38DD9">
-                              <wp:extent cx="1766454" cy="788035"/>
-                              <wp:effectExtent l="0" t="0" r="5715" b="0"/>
+                            <wp:inline distT="0" distB="0" distL="0" distR="0" wp14:anchorId="7E1130D4" wp14:editId="162F711B">
+                              <wp:extent cx="1730375" cy="795655"/>
+                              <wp:effectExtent l="0" t="0" r="3175" b="4445"/>
                               <wp:docPr id="1" name="Picture 92"/>
                               <wp:cNvGraphicFramePr>
                                 <a:graphicFrameLocks xmlns:a="http://schemas.openxmlformats.org/drawingml/2006/main" noChangeAspect="1"/>
@@ -33098,7 +34147,7 @@
                                     <pic:spPr bwMode="auto">
                                       <a:xfrm>
                                         <a:off x="0" y="0"/>
-                                        <a:ext cx="1784364" cy="796025"/>
+                                        <a:ext cx="1731184" cy="796027"/>
                                       </a:xfrm>
                                       <a:prstGeom prst="rect">
                                         <a:avLst/>
@@ -33187,17 +34236,7 @@
 </w:hdr>
 </file>
 
-<file path=word/header3.xml><?xml version="1.0" encoding="utf-8"?>
-<w:hdr xmlns:wpc="http://schemas.microsoft.com/office/word/2010/wordprocessingCanvas" xmlns:cx="http://schemas.microsoft.com/office/drawing/2014/chartex" xmlns:cx1="http://schemas.microsoft.com/office/drawing/2015/9/8/chartex" xmlns:cx2="http://schemas.microsoft.com/office/drawing/2015/10/21/chartex" xmlns:cx3="http://schemas.microsoft.com/office/drawing/2016/5/9/chartex" xmlns:cx4="http://schemas.microsoft.com/office/drawing/2016/5/10/chartex" xmlns:cx5="http://schemas.microsoft.com/office/drawing/2016/5/11/chartex" xmlns:cx6="http://schemas.microsoft.com/office/drawing/2016/5/12/chartex" xmlns:cx7="http://schemas.microsoft.com/office/drawing/2016/5/13/chartex" xmlns:cx8="http://schemas.microsoft.com/office/drawing/2016/5/14/chartex" xmlns:mc="http://schemas.openxmlformats.org/markup-compatibility/2006" xmlns:aink="http://schemas.microsoft.com/office/drawing/2016/ink" xmlns:am3d="http://schemas.microsoft.com/office/drawing/2017/model3d" xmlns:o="urn:schemas-microsoft-com:office:office" xmlns:oel="http://schemas.microsoft.com/office/2019/extlst" xmlns:r="http://schemas.openxmlformats.org/officeDocument/2006/relationships" xmlns:m="http://schemas.openxmlformats.org/officeDocument/2006/math" xmlns:v="urn:schemas-microsoft-com:vml" xmlns:wp14="http://schemas.microsoft.com/office/word/2010/wordprocessingDrawing" xmlns:wp="http://schemas.openxmlformats.org/drawingml/2006/wordprocessingDrawing" xmlns:w10="urn:schemas-microsoft-com:office:word" xmlns:w="http://schemas.openxmlformats.org/wordprocessingml/2006/main" xmlns:w14="http://schemas.microsoft.com/office/word/2010/wordml" xmlns:w15="http://schemas.microsoft.com/office/word/2012/wordml" xmlns:w16cex="http://schemas.microsoft.com/office/word/2018/wordml/cex" xmlns:w16cid="http://schemas.microsoft.com/office/word/2016/wordml/cid" xmlns:w16="http://schemas.microsoft.com/office/word/2018/wordml" xmlns:w16du="http://schemas.microsoft.com/office/word/2023/wordml/word16du" xmlns:w16sdtdh="http://schemas.microsoft.com/office/word/2020/wordml/sdtdatahash" xmlns:w16se="http://schemas.microsoft.com/office/word/2015/wordml/symex" xmlns:wpg="http://schemas.microsoft.com/office/word/2010/wordprocessingGroup" xmlns:wpi="http://schemas.microsoft.com/office/word/2010/wordprocessingInk" xmlns:wne="http://schemas.microsoft.com/office/word/2006/wordml" xmlns:wps="http://schemas.microsoft.com/office/word/2010/wordprocessingShape" mc:Ignorable="w14 w15 w16se w16cid w16 w16cex w16sdtdh w16du wp14">
-  <w:p>
-    <w:pPr>
-      <w:pStyle w:val="Header"/>
-    </w:pPr>
-  </w:p>
-</w:hdr>
-</file>
-
-<file path=word/header4.xml><?xml version="1.0" encoding="utf-8"?>
+<file path=word/header2.xml><?xml version="1.0" encoding="utf-8"?>
 <w:hdr xmlns:wpc="http://schemas.microsoft.com/office/word/2010/wordprocessingCanvas" xmlns:cx="http://schemas.microsoft.com/office/drawing/2014/chartex" xmlns:cx1="http://schemas.microsoft.com/office/drawing/2015/9/8/chartex" xmlns:cx2="http://schemas.microsoft.com/office/drawing/2015/10/21/chartex" xmlns:cx3="http://schemas.microsoft.com/office/drawing/2016/5/9/chartex" xmlns:cx4="http://schemas.microsoft.com/office/drawing/2016/5/10/chartex" xmlns:cx5="http://schemas.microsoft.com/office/drawing/2016/5/11/chartex" xmlns:cx6="http://schemas.microsoft.com/office/drawing/2016/5/12/chartex" xmlns:cx7="http://schemas.microsoft.com/office/drawing/2016/5/13/chartex" xmlns:cx8="http://schemas.microsoft.com/office/drawing/2016/5/14/chartex" xmlns:mc="http://schemas.openxmlformats.org/markup-compatibility/2006" xmlns:aink="http://schemas.microsoft.com/office/drawing/2016/ink" xmlns:am3d="http://schemas.microsoft.com/office/drawing/2017/model3d" xmlns:o="urn:schemas-microsoft-com:office:office" xmlns:oel="http://schemas.microsoft.com/office/2019/extlst" xmlns:r="http://schemas.openxmlformats.org/officeDocument/2006/relationships" xmlns:m="http://schemas.openxmlformats.org/officeDocument/2006/math" xmlns:v="urn:schemas-microsoft-com:vml" xmlns:wp14="http://schemas.microsoft.com/office/word/2010/wordprocessingDrawing" xmlns:wp="http://schemas.openxmlformats.org/drawingml/2006/wordprocessingDrawing" xmlns:w10="urn:schemas-microsoft-com:office:word" xmlns:w="http://schemas.openxmlformats.org/wordprocessingml/2006/main" xmlns:w14="http://schemas.microsoft.com/office/word/2010/wordml" xmlns:w15="http://schemas.microsoft.com/office/word/2012/wordml" xmlns:w16cex="http://schemas.microsoft.com/office/word/2018/wordml/cex" xmlns:w16cid="http://schemas.microsoft.com/office/word/2016/wordml/cid" xmlns:w16="http://schemas.microsoft.com/office/word/2018/wordml" xmlns:w16du="http://schemas.microsoft.com/office/word/2023/wordml/word16du" xmlns:w16sdtdh="http://schemas.microsoft.com/office/word/2020/wordml/sdtdatahash" xmlns:w16se="http://schemas.microsoft.com/office/word/2015/wordml/symex" xmlns:wpg="http://schemas.microsoft.com/office/word/2010/wordprocessingGroup" xmlns:wpi="http://schemas.microsoft.com/office/word/2010/wordprocessingInk" xmlns:wne="http://schemas.microsoft.com/office/word/2006/wordml" xmlns:wps="http://schemas.microsoft.com/office/word/2010/wordprocessingShape" mc:Ignorable="w14 w15 w16se w16cid w16 w16cex w16sdtdh w16du wp14">
   <w:p>
     <w:pPr>
@@ -33965,6 +35004,7 @@
   <w:style w:type="paragraph" w:default="1" w:styleId="Normal">
     <w:name w:val="Normal"/>
     <w:qFormat/>
+    <w:rsid w:val="00DB7E30"/>
   </w:style>
   <w:style w:type="character" w:default="1" w:styleId="DefaultParagraphFont">
     <w:name w:val="Default Paragraph Font"/>
@@ -34383,6 +35423,8 @@
     <w:rsid w:val="000260E9"/>
     <w:rsid w:val="00046EA2"/>
     <w:rsid w:val="00056182"/>
+    <w:rsid w:val="00086658"/>
+    <w:rsid w:val="000B15FE"/>
     <w:rsid w:val="000D38B9"/>
     <w:rsid w:val="000F0A9F"/>
     <w:rsid w:val="001058FA"/>
@@ -34394,6 +35436,7 @@
     <w:rsid w:val="001C768F"/>
     <w:rsid w:val="00200B21"/>
     <w:rsid w:val="0023756D"/>
+    <w:rsid w:val="002F4160"/>
     <w:rsid w:val="00306E7E"/>
     <w:rsid w:val="00340A44"/>
     <w:rsid w:val="00344ED6"/>
@@ -34411,14 +35454,17 @@
     <w:rsid w:val="00513070"/>
     <w:rsid w:val="0052743E"/>
     <w:rsid w:val="00530801"/>
+    <w:rsid w:val="00561C7A"/>
     <w:rsid w:val="005C20CF"/>
     <w:rsid w:val="005D299D"/>
     <w:rsid w:val="005F507D"/>
+    <w:rsid w:val="00685002"/>
     <w:rsid w:val="006A0A15"/>
     <w:rsid w:val="0070661B"/>
     <w:rsid w:val="00730390"/>
     <w:rsid w:val="0074486F"/>
     <w:rsid w:val="007A1815"/>
+    <w:rsid w:val="007A7101"/>
     <w:rsid w:val="0082517C"/>
     <w:rsid w:val="00842FE6"/>
     <w:rsid w:val="008522BE"/>
@@ -34451,6 +35497,7 @@
     <w:rsid w:val="00CC7084"/>
     <w:rsid w:val="00CE0208"/>
     <w:rsid w:val="00D0005C"/>
+    <w:rsid w:val="00D25D96"/>
     <w:rsid w:val="00D67D44"/>
     <w:rsid w:val="00DB3047"/>
     <w:rsid w:val="00DC4790"/>
@@ -34458,6 +35505,7 @@
     <w:rsid w:val="00E33B75"/>
     <w:rsid w:val="00E42B71"/>
     <w:rsid w:val="00E753D6"/>
+    <w:rsid w:val="00E77B79"/>
     <w:rsid w:val="00F30273"/>
     <w:rsid w:val="00F37F66"/>
     <w:rsid w:val="00F43983"/>
@@ -34920,7 +35968,7 @@
     <w:basedOn w:val="DefaultParagraphFont"/>
     <w:uiPriority w:val="99"/>
     <w:semiHidden/>
-    <w:rsid w:val="00901DCE"/>
+    <w:rsid w:val="00086658"/>
     <w:rPr>
       <w:color w:val="666666"/>
     </w:rPr>
@@ -35246,11 +36294,7 @@
 </a:theme>
 </file>
 
-<file path=customXml/item1.xml><?xml version="1.0" encoding="utf-8"?>
-<b:Sources xmlns:b="http://schemas.openxmlformats.org/officeDocument/2006/bibliography" xmlns="http://schemas.openxmlformats.org/officeDocument/2006/bibliography" SelectedStyle="\APASixthEditionOfficeOnline.xsl" StyleName="APA" Version="6"/>
-</file>
-
-<file path=customXml/item2.xml>��< ? x m l   v e r s i o n = " 1 . 0 "   e n c o d i n g = " u t f - 1 6 " ? > < N a v W o r d R e p o r t X m l P a r t   x m l n s = " u r n : m i c r o s o f t - d y n a m i c s - n a v / r e p o r t s / T e n a n c y _ C o n t r a c t / 5 0 1 0 1 / " > +<file path=customXml/item1.xml>��< ? x m l   v e r s i o n = " 1 . 0 "   e n c o d i n g = " u t f - 1 6 " ? > < N a v W o r d R e p o r t X m l P a r t   x m l n s = " u r n : m i c r o s o f t - d y n a m i c s - n a v / r e p o r t s / T e n a n c y _ C o n t r a c t / 5 0 1 0 1 / " >   
      < T e n a n c y C o n t r a c t >   
@@ -35270,9 +36314,13 @@
  
          < C o n t r a c t _ E n d _ D a t e > C o n t r a c t _ E n d _ D a t e < / C o n t r a c t _ E n d _ D a t e >   
+         < C o n t r a c t _ I D > C o n t r a c t _ I D < / C o n t r a c t _ I D > + 
          < C o n t r a c t _ S t a r t _ D a t e > C o n t r a c t _ S t a r t _ D a t e < / C o n t r a c t _ S t a r t _ D a t e >   
          < C o n t r a c t _ T e n o r > C o n t r a c t _ T e n o r < / C o n t r a c t _ T e n o r > + 
+         < C o n t r a c t _ T y p e > C o n t r a c t _ T y p e < / C o n t r a c t _ T y p e >   
          < C u s t o m e r N a m e > C u s t o m e r N a m e < / C u s t o m e r N a m e >   
@@ -35318,6 +36366,10 @@
  
          < P r o p e r t y _ S i z e > P r o p e r t y _ S i z e < / P r o p e r t y _ S i z e >   
+         < P r o p o s a l _ I D > P r o p o s a l _ I D < / P r o p o s a l _ I D > + 
+         < R e n e w a l _ P r o p o s a l _ I D > R e n e w a l _ P r o p o s a l _ I D < / R e n e w a l _ P r o p o s a l _ I D > + 
          < R e n t _ A m o u n t > R e n t _ A m o u n t < / R e n t _ A m o u n t >   
          < S e c u r i t y _ D e p o s i t _ A m o u n t > S e c u r i t y _ D e p o s i t _ A m o u n t < / S e c u r i t y _ D e p o s i t _ A m o u n t > @@ -35335,18 +36387,22 @@
  < / N a v W o r d R e p o r t X m l P a r t > 
 </file>
 
+<file path=customXml/item2.xml><?xml version="1.0" encoding="utf-8"?>
+<b:Sources xmlns:b="http://schemas.openxmlformats.org/officeDocument/2006/bibliography" xmlns="http://schemas.openxmlformats.org/officeDocument/2006/bibliography" SelectedStyle="\APASixthEditionOfficeOnline.xsl" StyleName="APA" Version="6"/>
+</file>
+
 <file path=customXml/itemProps1.xml><?xml version="1.0" encoding="utf-8"?>
+<ds:datastoreItem xmlns:ds="http://schemas.openxmlformats.org/officeDocument/2006/customXml" ds:itemID="{B8787D49-5AAC-4AAC-A9D8-A7D9793FE4D0}">
+  <ds:schemaRefs>
+    <ds:schemaRef ds:uri="urn:microsoft-dynamics-nav/reports/Tenancy_Contract/50101/"/>
+  </ds:schemaRefs>
+</ds:datastoreItem>
+</file>
+
+<file path=customXml/itemProps2.xml><?xml version="1.0" encoding="utf-8"?>
 <ds:datastoreItem xmlns:ds="http://schemas.openxmlformats.org/officeDocument/2006/customXml" ds:itemID="{B2FE98F9-7A23-46CC-9826-471773318048}">
   <ds:schemaRefs>
     <ds:schemaRef ds:uri="http://schemas.openxmlformats.org/officeDocument/2006/bibliography"/>
   </ds:schemaRefs>
 </ds:datastoreItem>
-</file>
-
-<file path=customXml/itemProps2.xml><?xml version="1.0" encoding="utf-8"?>
-<ds:datastoreItem xmlns:ds="http://schemas.openxmlformats.org/officeDocument/2006/customXml" ds:itemID="{B8787D49-5AAC-4AAC-A9D8-A7D9793FE4D0}">
-  <ds:schemaRefs>
-    <ds:schemaRef ds:uri="urn:microsoft-dynamics-nav/reports/Tenancy_Contract/50101/"/>
-  </ds:schemaRefs>
-</ds:datastoreItem>
 </file>
</xml_diff>